<commit_message>
Cập nhật giao diện và sửa lỗi
</commit_message>
<xml_diff>
--- a/assets/thesis/template_thesis.docx
+++ b/assets/thesis/template_thesis.docx
@@ -1538,7 +1538,7 @@
         <w:fldChar w:fldCharType="separate"/>
       </w:r>
       <w:r>
-        <w:t>4</w:t>
+        <w:t>5</w:t>
       </w:r>
       <w:r>
         <w:fldChar w:fldCharType="end"/>
@@ -1589,7 +1589,7 @@
         <w:fldChar w:fldCharType="separate"/>
       </w:r>
       <w:r>
-        <w:t>5</w:t>
+        <w:t>7</w:t>
       </w:r>
       <w:r>
         <w:fldChar w:fldCharType="end"/>
@@ -1640,7 +1640,7 @@
         <w:fldChar w:fldCharType="separate"/>
       </w:r>
       <w:r>
-        <w:t>6</w:t>
+        <w:t>8</w:t>
       </w:r>
       <w:r>
         <w:fldChar w:fldCharType="end"/>
@@ -1691,7 +1691,7 @@
         <w:fldChar w:fldCharType="separate"/>
       </w:r>
       <w:r>
-        <w:t>7</w:t>
+        <w:t>8</w:t>
       </w:r>
       <w:r>
         <w:fldChar w:fldCharType="end"/>
@@ -1742,7 +1742,7 @@
         <w:fldChar w:fldCharType="separate"/>
       </w:r>
       <w:r>
-        <w:t>8</w:t>
+        <w:t>9</w:t>
       </w:r>
       <w:r>
         <w:fldChar w:fldCharType="end"/>
@@ -1793,7 +1793,7 @@
         <w:fldChar w:fldCharType="separate"/>
       </w:r>
       <w:r>
-        <w:t>9</w:t>
+        <w:t>10</w:t>
       </w:r>
       <w:r>
         <w:fldChar w:fldCharType="end"/>
@@ -1844,7 +1844,7 @@
         <w:fldChar w:fldCharType="separate"/>
       </w:r>
       <w:r>
-        <w:t>9</w:t>
+        <w:t>10</w:t>
       </w:r>
       <w:r>
         <w:fldChar w:fldCharType="end"/>
@@ -1895,7 +1895,7 @@
         <w:fldChar w:fldCharType="separate"/>
       </w:r>
       <w:r>
-        <w:t>9</w:t>
+        <w:t>11</w:t>
       </w:r>
       <w:r>
         <w:fldChar w:fldCharType="end"/>
@@ -1946,7 +1946,7 @@
         <w:fldChar w:fldCharType="separate"/>
       </w:r>
       <w:r>
-        <w:t>10</w:t>
+        <w:t>11</w:t>
       </w:r>
       <w:r>
         <w:fldChar w:fldCharType="end"/>
@@ -1997,7 +1997,7 @@
         <w:fldChar w:fldCharType="separate"/>
       </w:r>
       <w:r>
-        <w:t>11</w:t>
+        <w:t>12</w:t>
       </w:r>
       <w:r>
         <w:fldChar w:fldCharType="end"/>
@@ -2048,7 +2048,7 @@
         <w:fldChar w:fldCharType="separate"/>
       </w:r>
       <w:r>
-        <w:t>11</w:t>
+        <w:t>12</w:t>
       </w:r>
       <w:r>
         <w:fldChar w:fldCharType="end"/>
@@ -2099,7 +2099,7 @@
         <w:fldChar w:fldCharType="separate"/>
       </w:r>
       <w:r>
-        <w:t>11</w:t>
+        <w:t>12</w:t>
       </w:r>
       <w:r>
         <w:fldChar w:fldCharType="end"/>
@@ -2150,7 +2150,7 @@
         <w:fldChar w:fldCharType="separate"/>
       </w:r>
       <w:r>
-        <w:t>12</w:t>
+        <w:t>13</w:t>
       </w:r>
       <w:r>
         <w:fldChar w:fldCharType="end"/>
@@ -2201,7 +2201,7 @@
         <w:fldChar w:fldCharType="separate"/>
       </w:r>
       <w:r>
-        <w:t>17</w:t>
+        <w:t>18</w:t>
       </w:r>
       <w:r>
         <w:fldChar w:fldCharType="end"/>
@@ -2252,7 +2252,7 @@
         <w:fldChar w:fldCharType="separate"/>
       </w:r>
       <w:r>
-        <w:t>17</w:t>
+        <w:t>18</w:t>
       </w:r>
       <w:r>
         <w:fldChar w:fldCharType="end"/>
@@ -2303,7 +2303,7 @@
         <w:fldChar w:fldCharType="separate"/>
       </w:r>
       <w:r>
-        <w:t>17</w:t>
+        <w:t>19</w:t>
       </w:r>
       <w:r>
         <w:fldChar w:fldCharType="end"/>
@@ -2354,7 +2354,7 @@
         <w:fldChar w:fldCharType="separate"/>
       </w:r>
       <w:r>
-        <w:t>19</w:t>
+        <w:t>20</w:t>
       </w:r>
       <w:r>
         <w:fldChar w:fldCharType="end"/>
@@ -2405,7 +2405,7 @@
         <w:fldChar w:fldCharType="separate"/>
       </w:r>
       <w:r>
-        <w:t>19</w:t>
+        <w:t>20</w:t>
       </w:r>
       <w:r>
         <w:fldChar w:fldCharType="end"/>
@@ -2456,7 +2456,7 @@
         <w:fldChar w:fldCharType="separate"/>
       </w:r>
       <w:r>
-        <w:t>19</w:t>
+        <w:t>20</w:t>
       </w:r>
       <w:r>
         <w:fldChar w:fldCharType="end"/>
@@ -2507,7 +2507,7 @@
         <w:fldChar w:fldCharType="separate"/>
       </w:r>
       <w:r>
-        <w:t>19</w:t>
+        <w:t>20</w:t>
       </w:r>
       <w:r>
         <w:fldChar w:fldCharType="end"/>
@@ -2558,7 +2558,7 @@
         <w:fldChar w:fldCharType="separate"/>
       </w:r>
       <w:r>
-        <w:t>19</w:t>
+        <w:t>20</w:t>
       </w:r>
       <w:r>
         <w:fldChar w:fldCharType="end"/>
@@ -2609,7 +2609,7 @@
         <w:fldChar w:fldCharType="separate"/>
       </w:r>
       <w:r>
-        <w:t>20</w:t>
+        <w:t>21</w:t>
       </w:r>
       <w:r>
         <w:fldChar w:fldCharType="end"/>
@@ -2660,7 +2660,7 @@
         <w:fldChar w:fldCharType="separate"/>
       </w:r>
       <w:r>
-        <w:t>20</w:t>
+        <w:t>21</w:t>
       </w:r>
       <w:r>
         <w:fldChar w:fldCharType="end"/>
@@ -2711,7 +2711,7 @@
         <w:fldChar w:fldCharType="separate"/>
       </w:r>
       <w:r>
-        <w:t>21</w:t>
+        <w:t>22</w:t>
       </w:r>
       <w:r>
         <w:fldChar w:fldCharType="end"/>
@@ -2762,7 +2762,7 @@
         <w:fldChar w:fldCharType="separate"/>
       </w:r>
       <w:r>
-        <w:t>21</w:t>
+        <w:t>22</w:t>
       </w:r>
       <w:r>
         <w:fldChar w:fldCharType="end"/>
@@ -2813,7 +2813,7 @@
         <w:fldChar w:fldCharType="separate"/>
       </w:r>
       <w:r>
-        <w:t>22</w:t>
+        <w:t>23</w:t>
       </w:r>
       <w:r>
         <w:fldChar w:fldCharType="end"/>
@@ -2864,7 +2864,7 @@
         <w:fldChar w:fldCharType="separate"/>
       </w:r>
       <w:r>
-        <w:t>22</w:t>
+        <w:t>23</w:t>
       </w:r>
       <w:r>
         <w:fldChar w:fldCharType="end"/>
@@ -2915,7 +2915,7 @@
         <w:fldChar w:fldCharType="separate"/>
       </w:r>
       <w:r>
-        <w:t>23</w:t>
+        <w:t>24</w:t>
       </w:r>
       <w:r>
         <w:fldChar w:fldCharType="end"/>
@@ -2966,7 +2966,7 @@
         <w:fldChar w:fldCharType="separate"/>
       </w:r>
       <w:r>
-        <w:t>23</w:t>
+        <w:t>24</w:t>
       </w:r>
       <w:r>
         <w:fldChar w:fldCharType="end"/>
@@ -3017,7 +3017,7 @@
         <w:fldChar w:fldCharType="separate"/>
       </w:r>
       <w:r>
-        <w:t>24</w:t>
+        <w:t>25</w:t>
       </w:r>
       <w:r>
         <w:fldChar w:fldCharType="end"/>
@@ -3068,7 +3068,7 @@
         <w:fldChar w:fldCharType="separate"/>
       </w:r>
       <w:r>
-        <w:t>25</w:t>
+        <w:t>26</w:t>
       </w:r>
       <w:r>
         <w:fldChar w:fldCharType="end"/>
@@ -3119,7 +3119,7 @@
         <w:fldChar w:fldCharType="separate"/>
       </w:r>
       <w:r>
-        <w:t>26</w:t>
+        <w:t>28</w:t>
       </w:r>
       <w:r>
         <w:fldChar w:fldCharType="end"/>
@@ -3170,7 +3170,7 @@
         <w:fldChar w:fldCharType="separate"/>
       </w:r>
       <w:r>
-        <w:t>26</w:t>
+        <w:t>28</w:t>
       </w:r>
       <w:r>
         <w:fldChar w:fldCharType="end"/>
@@ -3221,7 +3221,7 @@
         <w:fldChar w:fldCharType="separate"/>
       </w:r>
       <w:r>
-        <w:t>26</w:t>
+        <w:t>28</w:t>
       </w:r>
       <w:r>
         <w:fldChar w:fldCharType="end"/>
@@ -3272,7 +3272,7 @@
         <w:fldChar w:fldCharType="separate"/>
       </w:r>
       <w:r>
-        <w:t>26</w:t>
+        <w:t>28</w:t>
       </w:r>
       <w:r>
         <w:fldChar w:fldCharType="end"/>
@@ -3323,7 +3323,7 @@
         <w:fldChar w:fldCharType="separate"/>
       </w:r>
       <w:r>
-        <w:t>27</w:t>
+        <w:t>29</w:t>
       </w:r>
       <w:r>
         <w:fldChar w:fldCharType="end"/>
@@ -3374,7 +3374,7 @@
         <w:fldChar w:fldCharType="separate"/>
       </w:r>
       <w:r>
-        <w:t>28</w:t>
+        <w:t>30</w:t>
       </w:r>
       <w:r>
         <w:fldChar w:fldCharType="end"/>
@@ -3426,7 +3426,7 @@
         <w:fldChar w:fldCharType="separate"/>
       </w:r>
       <w:r>
-        <w:t>29</w:t>
+        <w:t>31</w:t>
       </w:r>
       <w:r>
         <w:fldChar w:fldCharType="end"/>
@@ -3478,7 +3478,7 @@
         <w:fldChar w:fldCharType="separate"/>
       </w:r>
       <w:r>
-        <w:t>29</w:t>
+        <w:t>32</w:t>
       </w:r>
       <w:r>
         <w:fldChar w:fldCharType="end"/>
@@ -3530,7 +3530,7 @@
         <w:fldChar w:fldCharType="separate"/>
       </w:r>
       <w:r>
-        <w:t>30</w:t>
+        <w:t>33</w:t>
       </w:r>
       <w:r>
         <w:fldChar w:fldCharType="end"/>
@@ -3581,7 +3581,7 @@
         <w:fldChar w:fldCharType="separate"/>
       </w:r>
       <w:r>
-        <w:t>32</w:t>
+        <w:t>35</w:t>
       </w:r>
       <w:r>
         <w:fldChar w:fldCharType="end"/>
@@ -3632,7 +3632,7 @@
         <w:fldChar w:fldCharType="separate"/>
       </w:r>
       <w:r>
-        <w:t>32</w:t>
+        <w:t>35</w:t>
       </w:r>
       <w:r>
         <w:fldChar w:fldCharType="end"/>
@@ -3683,7 +3683,7 @@
         <w:fldChar w:fldCharType="separate"/>
       </w:r>
       <w:r>
-        <w:t>32</w:t>
+        <w:t>35</w:t>
       </w:r>
       <w:r>
         <w:fldChar w:fldCharType="end"/>
@@ -3743,7 +3743,7 @@
         <w:fldChar w:fldCharType="begin"/>
       </w:r>
       <w:r>
-        <w:instrText xml:space="preserve"> HYPERLINK \l _Toc11607 </w:instrText>
+        <w:instrText xml:space="preserve"> HYPERLINK \l _Toc16309 </w:instrText>
       </w:r>
       <w:r>
         <w:fldChar w:fldCharType="separate"/>
@@ -3773,7 +3773,7 @@
         <w:fldChar w:fldCharType="begin"/>
       </w:r>
       <w:r>
-        <w:instrText xml:space="preserve"> PAGEREF _Toc11607 \h </w:instrText>
+        <w:instrText xml:space="preserve"> PAGEREF _Toc16309 \h </w:instrText>
       </w:r>
       <w:r>
         <w:fldChar w:fldCharType="separate"/>
@@ -3799,7 +3799,7 @@
         <w:fldChar w:fldCharType="begin"/>
       </w:r>
       <w:r>
-        <w:instrText xml:space="preserve"> HYPERLINK \l _Toc9283 </w:instrText>
+        <w:instrText xml:space="preserve"> HYPERLINK \l _Toc24493 </w:instrText>
       </w:r>
       <w:r>
         <w:fldChar w:fldCharType="separate"/>
@@ -3829,13 +3829,13 @@
         <w:fldChar w:fldCharType="begin"/>
       </w:r>
       <w:r>
-        <w:instrText xml:space="preserve"> PAGEREF _Toc9283 \h </w:instrText>
+        <w:instrText xml:space="preserve"> PAGEREF _Toc24493 \h </w:instrText>
       </w:r>
       <w:r>
         <w:fldChar w:fldCharType="separate"/>
       </w:r>
       <w:r>
-        <w:t>22</w:t>
+        <w:t>23</w:t>
       </w:r>
       <w:r>
         <w:fldChar w:fldCharType="end"/>
@@ -3855,7 +3855,7 @@
         <w:fldChar w:fldCharType="begin"/>
       </w:r>
       <w:r>
-        <w:instrText xml:space="preserve"> HYPERLINK \l _Toc20937 </w:instrText>
+        <w:instrText xml:space="preserve"> HYPERLINK \l _Toc23408 </w:instrText>
       </w:r>
       <w:r>
         <w:fldChar w:fldCharType="separate"/>
@@ -3885,13 +3885,13 @@
         <w:fldChar w:fldCharType="begin"/>
       </w:r>
       <w:r>
-        <w:instrText xml:space="preserve"> PAGEREF _Toc20937 \h </w:instrText>
+        <w:instrText xml:space="preserve"> PAGEREF _Toc23408 \h </w:instrText>
       </w:r>
       <w:r>
         <w:fldChar w:fldCharType="separate"/>
       </w:r>
       <w:r>
-        <w:t>23</w:t>
+        <w:t>24</w:t>
       </w:r>
       <w:r>
         <w:fldChar w:fldCharType="end"/>
@@ -3911,7 +3911,7 @@
         <w:fldChar w:fldCharType="begin"/>
       </w:r>
       <w:r>
-        <w:instrText xml:space="preserve"> HYPERLINK \l _Toc7934 </w:instrText>
+        <w:instrText xml:space="preserve"> HYPERLINK \l _Toc2531 </w:instrText>
       </w:r>
       <w:r>
         <w:fldChar w:fldCharType="separate"/>
@@ -3941,13 +3941,13 @@
         <w:fldChar w:fldCharType="begin"/>
       </w:r>
       <w:r>
-        <w:instrText xml:space="preserve"> PAGEREF _Toc7934 \h </w:instrText>
+        <w:instrText xml:space="preserve"> PAGEREF _Toc2531 \h </w:instrText>
       </w:r>
       <w:r>
         <w:fldChar w:fldCharType="separate"/>
       </w:r>
       <w:r>
-        <w:t>24</w:t>
+        <w:t>25</w:t>
       </w:r>
       <w:r>
         <w:fldChar w:fldCharType="end"/>
@@ -3967,7 +3967,7 @@
         <w:fldChar w:fldCharType="begin"/>
       </w:r>
       <w:r>
-        <w:instrText xml:space="preserve"> HYPERLINK \l _Toc13245 </w:instrText>
+        <w:instrText xml:space="preserve"> HYPERLINK \l _Toc513 </w:instrText>
       </w:r>
       <w:r>
         <w:fldChar w:fldCharType="separate"/>
@@ -3997,13 +3997,13 @@
         <w:fldChar w:fldCharType="begin"/>
       </w:r>
       <w:r>
-        <w:instrText xml:space="preserve"> PAGEREF _Toc13245 \h </w:instrText>
+        <w:instrText xml:space="preserve"> PAGEREF _Toc513 \h </w:instrText>
       </w:r>
       <w:r>
         <w:fldChar w:fldCharType="separate"/>
       </w:r>
       <w:r>
-        <w:t>25</w:t>
+        <w:t>26</w:t>
       </w:r>
       <w:r>
         <w:fldChar w:fldCharType="end"/>
@@ -4023,7 +4023,7 @@
         <w:fldChar w:fldCharType="begin"/>
       </w:r>
       <w:r>
-        <w:instrText xml:space="preserve"> HYPERLINK \l _Toc15881 </w:instrText>
+        <w:instrText xml:space="preserve"> HYPERLINK \l _Toc508 </w:instrText>
       </w:r>
       <w:r>
         <w:fldChar w:fldCharType="separate"/>
@@ -4053,13 +4053,13 @@
         <w:fldChar w:fldCharType="begin"/>
       </w:r>
       <w:r>
-        <w:instrText xml:space="preserve"> PAGEREF _Toc15881 \h </w:instrText>
+        <w:instrText xml:space="preserve"> PAGEREF _Toc508 \h </w:instrText>
       </w:r>
       <w:r>
         <w:fldChar w:fldCharType="separate"/>
       </w:r>
       <w:r>
-        <w:t>26</w:t>
+        <w:t>27</w:t>
       </w:r>
       <w:r>
         <w:fldChar w:fldCharType="end"/>
@@ -4079,7 +4079,7 @@
         <w:fldChar w:fldCharType="begin"/>
       </w:r>
       <w:r>
-        <w:instrText xml:space="preserve"> HYPERLINK \l _Toc32082 </w:instrText>
+        <w:instrText xml:space="preserve"> HYPERLINK \l _Toc17588 </w:instrText>
       </w:r>
       <w:r>
         <w:fldChar w:fldCharType="separate"/>
@@ -4109,13 +4109,13 @@
         <w:fldChar w:fldCharType="begin"/>
       </w:r>
       <w:r>
-        <w:instrText xml:space="preserve"> PAGEREF _Toc32082 \h </w:instrText>
+        <w:instrText xml:space="preserve"> PAGEREF _Toc17588 \h </w:instrText>
       </w:r>
       <w:r>
         <w:fldChar w:fldCharType="separate"/>
       </w:r>
       <w:r>
-        <w:t>28</w:t>
+        <w:t>29</w:t>
       </w:r>
       <w:r>
         <w:fldChar w:fldCharType="end"/>
@@ -4135,7 +4135,7 @@
         <w:fldChar w:fldCharType="begin"/>
       </w:r>
       <w:r>
-        <w:instrText xml:space="preserve"> HYPERLINK \l _Toc31001 </w:instrText>
+        <w:instrText xml:space="preserve"> HYPERLINK \l _Toc24503 </w:instrText>
       </w:r>
       <w:r>
         <w:fldChar w:fldCharType="separate"/>
@@ -4165,13 +4165,13 @@
         <w:fldChar w:fldCharType="begin"/>
       </w:r>
       <w:r>
-        <w:instrText xml:space="preserve"> PAGEREF _Toc31001 \h </w:instrText>
+        <w:instrText xml:space="preserve"> PAGEREF _Toc24503 \h </w:instrText>
       </w:r>
       <w:r>
         <w:fldChar w:fldCharType="separate"/>
       </w:r>
       <w:r>
-        <w:t>29</w:t>
+        <w:t>30</w:t>
       </w:r>
       <w:r>
         <w:fldChar w:fldCharType="end"/>
@@ -4191,7 +4191,7 @@
         <w:fldChar w:fldCharType="begin"/>
       </w:r>
       <w:r>
-        <w:instrText xml:space="preserve"> HYPERLINK \l _Toc17805 </w:instrText>
+        <w:instrText xml:space="preserve"> HYPERLINK \l _Toc22112 </w:instrText>
       </w:r>
       <w:r>
         <w:fldChar w:fldCharType="separate"/>
@@ -4221,13 +4221,13 @@
         <w:fldChar w:fldCharType="begin"/>
       </w:r>
       <w:r>
-        <w:instrText xml:space="preserve"> PAGEREF _Toc17805 \h </w:instrText>
+        <w:instrText xml:space="preserve"> PAGEREF _Toc22112 \h </w:instrText>
       </w:r>
       <w:r>
         <w:fldChar w:fldCharType="separate"/>
       </w:r>
       <w:r>
-        <w:t>30</w:t>
+        <w:t>31</w:t>
       </w:r>
       <w:r>
         <w:fldChar w:fldCharType="end"/>
@@ -4247,7 +4247,7 @@
         <w:fldChar w:fldCharType="begin"/>
       </w:r>
       <w:r>
-        <w:instrText xml:space="preserve"> HYPERLINK \l _Toc3591 </w:instrText>
+        <w:instrText xml:space="preserve"> HYPERLINK \l _Toc13010 </w:instrText>
       </w:r>
       <w:r>
         <w:fldChar w:fldCharType="separate"/>
@@ -4277,13 +4277,13 @@
         <w:fldChar w:fldCharType="begin"/>
       </w:r>
       <w:r>
-        <w:instrText xml:space="preserve"> PAGEREF _Toc3591 \h </w:instrText>
+        <w:instrText xml:space="preserve"> PAGEREF _Toc13010 \h </w:instrText>
       </w:r>
       <w:r>
         <w:fldChar w:fldCharType="separate"/>
       </w:r>
       <w:r>
-        <w:t>31</w:t>
+        <w:t>32</w:t>
       </w:r>
       <w:r>
         <w:fldChar w:fldCharType="end"/>
@@ -4303,7 +4303,7 @@
         <w:fldChar w:fldCharType="begin"/>
       </w:r>
       <w:r>
-        <w:instrText xml:space="preserve"> HYPERLINK \l _Toc7327 </w:instrText>
+        <w:instrText xml:space="preserve"> HYPERLINK \l _Toc15328 </w:instrText>
       </w:r>
       <w:r>
         <w:fldChar w:fldCharType="separate"/>
@@ -4333,13 +4333,13 @@
         <w:fldChar w:fldCharType="begin"/>
       </w:r>
       <w:r>
-        <w:instrText xml:space="preserve"> PAGEREF _Toc7327 \h </w:instrText>
+        <w:instrText xml:space="preserve"> PAGEREF _Toc15328 \h </w:instrText>
       </w:r>
       <w:r>
         <w:fldChar w:fldCharType="separate"/>
       </w:r>
       <w:r>
-        <w:t>32</w:t>
+        <w:t>33</w:t>
       </w:r>
       <w:r>
         <w:fldChar w:fldCharType="end"/>
@@ -4359,7 +4359,7 @@
         <w:fldChar w:fldCharType="begin"/>
       </w:r>
       <w:r>
-        <w:instrText xml:space="preserve"> HYPERLINK \l _Toc3886 </w:instrText>
+        <w:instrText xml:space="preserve"> HYPERLINK \l _Toc22307 </w:instrText>
       </w:r>
       <w:r>
         <w:fldChar w:fldCharType="separate"/>
@@ -4389,13 +4389,13 @@
         <w:fldChar w:fldCharType="begin"/>
       </w:r>
       <w:r>
-        <w:instrText xml:space="preserve"> PAGEREF _Toc3886 \h </w:instrText>
+        <w:instrText xml:space="preserve"> PAGEREF _Toc22307 \h </w:instrText>
       </w:r>
       <w:r>
         <w:fldChar w:fldCharType="separate"/>
       </w:r>
       <w:r>
-        <w:t>33</w:t>
+        <w:t>34</w:t>
       </w:r>
       <w:r>
         <w:fldChar w:fldCharType="end"/>
@@ -4433,8 +4433,6 @@
       <w:pPr>
         <w:pStyle w:val="36"/>
       </w:pPr>
-      <w:bookmarkStart w:id="127" w:name="_GoBack"/>
-      <w:bookmarkEnd w:id="127"/>
     </w:p>
     <w:p>
       <w:pPr>
@@ -4525,7 +4523,7 @@
         <w:fldChar w:fldCharType="separate"/>
       </w:r>
       <w:r>
-        <w:t>12</w:t>
+        <w:t>13</w:t>
       </w:r>
       <w:r>
         <w:fldChar w:fldCharType="end"/>
@@ -4581,7 +4579,7 @@
         <w:fldChar w:fldCharType="separate"/>
       </w:r>
       <w:r>
-        <w:t>13</w:t>
+        <w:t>14</w:t>
       </w:r>
       <w:r>
         <w:fldChar w:fldCharType="end"/>
@@ -4637,7 +4635,7 @@
         <w:fldChar w:fldCharType="separate"/>
       </w:r>
       <w:r>
-        <w:t>20</w:t>
+        <w:t>21</w:t>
       </w:r>
       <w:r>
         <w:fldChar w:fldCharType="end"/>
@@ -4693,7 +4691,7 @@
         <w:fldChar w:fldCharType="separate"/>
       </w:r>
       <w:r>
-        <w:t>21</w:t>
+        <w:t>22</w:t>
       </w:r>
       <w:r>
         <w:fldChar w:fldCharType="end"/>
@@ -4749,7 +4747,7 @@
         <w:fldChar w:fldCharType="separate"/>
       </w:r>
       <w:r>
-        <w:t>27</w:t>
+        <w:t>28</w:t>
       </w:r>
       <w:r>
         <w:fldChar w:fldCharType="end"/>
@@ -4775,6 +4773,8 @@
       <w:pPr>
         <w:pStyle w:val="36"/>
       </w:pPr>
+      <w:bookmarkStart w:id="139" w:name="_GoBack"/>
+      <w:bookmarkEnd w:id="139"/>
     </w:p>
     <w:p>
       <w:pPr>
@@ -4805,8 +4805,8 @@
         <w:pStyle w:val="3"/>
       </w:pPr>
       <w:bookmarkStart w:id="1" w:name="_Toc231633272"/>
-      <w:bookmarkStart w:id="2" w:name="_Toc1424072350"/>
-      <w:bookmarkStart w:id="3" w:name="_Toc230160098"/>
+      <w:bookmarkStart w:id="2" w:name="_Toc230160098"/>
+      <w:bookmarkStart w:id="3" w:name="_Toc1424072350"/>
       <w:r>
         <w:t>Đặt vấn đề</w:t>
       </w:r>
@@ -4860,8 +4860,8 @@
       <w:pPr>
         <w:pStyle w:val="3"/>
       </w:pPr>
-      <w:bookmarkStart w:id="4" w:name="_Toc231633273"/>
-      <w:bookmarkStart w:id="5" w:name="_Toc230160099"/>
+      <w:bookmarkStart w:id="4" w:name="_Toc230160099"/>
+      <w:bookmarkStart w:id="5" w:name="_Toc231633273"/>
       <w:bookmarkStart w:id="6" w:name="_Toc1099010587"/>
       <w:r>
         <w:t>Mục tiêu nghiên cứu</w:t>
@@ -5117,9 +5117,9 @@
       <w:pPr>
         <w:pStyle w:val="3"/>
       </w:pPr>
-      <w:bookmarkStart w:id="14" w:name="_Toc230160103"/>
-      <w:bookmarkStart w:id="15" w:name="_Toc616148396"/>
-      <w:bookmarkStart w:id="16" w:name="_Toc231633277"/>
+      <w:bookmarkStart w:id="14" w:name="_Toc616148396"/>
+      <w:bookmarkStart w:id="15" w:name="_Toc231633277"/>
+      <w:bookmarkStart w:id="16" w:name="_Toc230160103"/>
       <w:r>
         <w:t>Tổng quan về thiết kế web</w:t>
       </w:r>
@@ -5360,6 +5360,7 @@
         <w:fldChar w:fldCharType="end"/>
       </w:r>
       <w:bookmarkStart w:id="21" w:name="_Toc11607"/>
+      <w:bookmarkStart w:id="22" w:name="_Toc16309"/>
       <w:r>
         <w:rPr>
           <w:lang w:val="en-US"/>
@@ -5367,6 +5368,7 @@
         <w:t xml:space="preserve"> Cấu trúc của trang HTML</w:t>
       </w:r>
       <w:bookmarkEnd w:id="21"/>
+      <w:bookmarkEnd w:id="22"/>
     </w:p>
     <w:p>
       <w:pPr>
@@ -5376,11 +5378,11 @@
           <w:numId w:val="0"/>
         </w:numPr>
       </w:pPr>
-      <w:bookmarkStart w:id="22" w:name="_Toc231633281"/>
+      <w:bookmarkStart w:id="23" w:name="_Toc231633281"/>
       <w:r>
         <w:t>2.2.3   Một số lưu ý cơ bản của HTML</w:t>
       </w:r>
-      <w:bookmarkEnd w:id="22"/>
+      <w:bookmarkEnd w:id="23"/>
     </w:p>
     <w:p>
       <w:pPr>
@@ -5447,6 +5449,591 @@
       </w:pPr>
       <w:r>
         <w:t>Tránh việc viết code dài trên một dòng, viết code quá dài phải sử dụng thanh trượt để xem điều đó rất bất tiện. Nên viết code lùi đầu dòng và các dòng để cho bài code của mình dễ đọc dễ hiểu và dễ sửa lỗi (nếu có lỗi), tăng độ thẩm mỹ cho bài code. Việc này đối với bảng và danh sách giúp người viết code dễ dàng tưởng tượng ra được bố cục mà mình đang viết.</w:t>
+      </w:r>
+    </w:p>
+    <w:p>
+      <w:pPr>
+        <w:pStyle w:val="26"/>
+        <w:numPr>
+          <w:ilvl w:val="0"/>
+          <w:numId w:val="2"/>
+        </w:numPr>
+        <w:spacing w:after="160" w:afterAutospacing="0" w:line="360" w:lineRule="auto"/>
+        <w:rPr>
+          <w:rFonts w:ascii="Times New Roman" w:hAnsi="Times New Roman" w:eastAsia="Times New Roman" w:cs="Times New Roman"/>
+          <w:sz w:val="26"/>
+          <w:szCs w:val="26"/>
+          <w:lang w:val="en-US"/>
+        </w:rPr>
+      </w:pPr>
+      <w:r>
+        <w:rPr>
+          <w:rFonts w:ascii="Times New Roman" w:hAnsi="Times New Roman" w:eastAsia="Times New Roman" w:cs="Times New Roman"/>
+          <w:sz w:val="26"/>
+          <w:szCs w:val="26"/>
+          <w:lang w:val="en-US"/>
+        </w:rPr>
+        <w:t>Đối với file code nên viết:</w:t>
+      </w:r>
+    </w:p>
+    <w:p>
+      <w:pPr>
+        <w:spacing w:after="160" w:afterAutospacing="0" w:line="240" w:lineRule="auto"/>
+        <w:ind w:firstLine="720"/>
+        <w:rPr>
+          <w:rFonts w:ascii="Times New Roman" w:hAnsi="Times New Roman" w:eastAsia="Times New Roman" w:cs="Times New Roman"/>
+          <w:sz w:val="26"/>
+          <w:szCs w:val="26"/>
+          <w:lang w:val="en-US"/>
+        </w:rPr>
+      </w:pPr>
+      <w:r>
+        <w:rPr>
+          <w:rFonts w:ascii="Times New Roman" w:hAnsi="Times New Roman" w:eastAsia="Times New Roman" w:cs="Times New Roman"/>
+          <w:sz w:val="26"/>
+          <w:szCs w:val="26"/>
+          <w:lang w:val="en-US"/>
+        </w:rPr>
+        <w:t>&lt;body&gt;</w:t>
+      </w:r>
+    </w:p>
+    <w:p>
+      <w:pPr>
+        <w:spacing w:after="160" w:afterAutospacing="0" w:line="240" w:lineRule="auto"/>
+        <w:ind w:firstLine="902"/>
+        <w:rPr>
+          <w:rFonts w:ascii="Times New Roman" w:hAnsi="Times New Roman" w:eastAsia="Times New Roman" w:cs="Times New Roman"/>
+          <w:sz w:val="26"/>
+          <w:szCs w:val="26"/>
+          <w:lang w:val="en-US"/>
+        </w:rPr>
+      </w:pPr>
+      <w:r>
+        <w:rPr>
+          <w:rFonts w:ascii="Times New Roman" w:hAnsi="Times New Roman" w:eastAsia="Times New Roman" w:cs="Times New Roman"/>
+          <w:sz w:val="26"/>
+          <w:szCs w:val="26"/>
+          <w:lang w:val="en-US"/>
+        </w:rPr>
+        <w:t xml:space="preserve">   &lt;h1&gt;Tiêu đề&lt;/h1&gt;</w:t>
+      </w:r>
+    </w:p>
+    <w:p>
+      <w:pPr>
+        <w:spacing w:after="160" w:afterAutospacing="0" w:line="240" w:lineRule="auto"/>
+        <w:ind w:firstLine="720"/>
+        <w:rPr>
+          <w:rFonts w:ascii="Times New Roman" w:hAnsi="Times New Roman" w:eastAsia="Times New Roman" w:cs="Times New Roman"/>
+          <w:sz w:val="26"/>
+          <w:szCs w:val="26"/>
+          <w:lang w:val="en-US"/>
+        </w:rPr>
+      </w:pPr>
+      <w:r>
+        <w:rPr>
+          <w:rFonts w:ascii="Times New Roman" w:hAnsi="Times New Roman" w:eastAsia="Times New Roman" w:cs="Times New Roman"/>
+          <w:sz w:val="26"/>
+          <w:szCs w:val="26"/>
+          <w:lang w:val="en-US"/>
+        </w:rPr>
+        <w:t xml:space="preserve">    &lt;h2&gt;Bài báo cáo thiết kế web&lt;/h2&gt;</w:t>
+      </w:r>
+    </w:p>
+    <w:p>
+      <w:pPr>
+        <w:spacing w:after="160" w:afterAutospacing="0" w:line="240" w:lineRule="auto"/>
+        <w:ind w:firstLine="720"/>
+        <w:rPr>
+          <w:rFonts w:ascii="Times New Roman" w:hAnsi="Times New Roman" w:eastAsia="Times New Roman" w:cs="Times New Roman"/>
+          <w:sz w:val="26"/>
+          <w:szCs w:val="26"/>
+          <w:lang w:val="en-US"/>
+        </w:rPr>
+      </w:pPr>
+      <w:r>
+        <w:rPr>
+          <w:rFonts w:ascii="Times New Roman" w:hAnsi="Times New Roman" w:eastAsia="Times New Roman" w:cs="Times New Roman"/>
+          <w:sz w:val="26"/>
+          <w:szCs w:val="26"/>
+          <w:lang w:val="en-US"/>
+        </w:rPr>
+        <w:t xml:space="preserve">    &lt;p&gt;</w:t>
+      </w:r>
+    </w:p>
+    <w:p>
+      <w:pPr>
+        <w:spacing w:after="160" w:afterAutospacing="0" w:line="240" w:lineRule="auto"/>
+        <w:ind w:firstLine="720"/>
+        <w:rPr>
+          <w:rFonts w:ascii="Times New Roman" w:hAnsi="Times New Roman" w:eastAsia="Times New Roman" w:cs="Times New Roman"/>
+          <w:sz w:val="26"/>
+          <w:szCs w:val="26"/>
+          <w:lang w:val="en-US"/>
+        </w:rPr>
+      </w:pPr>
+      <w:r>
+        <w:rPr>
+          <w:rFonts w:ascii="Times New Roman" w:hAnsi="Times New Roman" w:eastAsia="Times New Roman" w:cs="Times New Roman"/>
+          <w:sz w:val="26"/>
+          <w:szCs w:val="26"/>
+          <w:lang w:val="en-US"/>
+        </w:rPr>
+        <w:t xml:space="preserve">        Ngôn ngữ html là ngôn ngữ viết trang web tĩnh. Với các cặp thẻ đa dạng </w:t>
+      </w:r>
+      <w:r>
+        <w:tab/>
+      </w:r>
+      <w:r>
+        <w:tab/>
+      </w:r>
+      <w:r>
+        <w:rPr>
+          <w:rFonts w:ascii="Times New Roman" w:hAnsi="Times New Roman" w:eastAsia="Times New Roman" w:cs="Times New Roman"/>
+          <w:sz w:val="26"/>
+          <w:szCs w:val="26"/>
+          <w:lang w:val="en-US"/>
+        </w:rPr>
+        <w:t>dễ sử dụng, tiện lợi.</w:t>
+      </w:r>
+    </w:p>
+    <w:p>
+      <w:pPr>
+        <w:spacing w:after="160" w:afterAutospacing="0" w:line="240" w:lineRule="auto"/>
+        <w:ind w:firstLine="720"/>
+        <w:rPr>
+          <w:rFonts w:ascii="Times New Roman" w:hAnsi="Times New Roman" w:eastAsia="Times New Roman" w:cs="Times New Roman"/>
+          <w:sz w:val="26"/>
+          <w:szCs w:val="26"/>
+          <w:lang w:val="en-US"/>
+        </w:rPr>
+      </w:pPr>
+      <w:r>
+        <w:rPr>
+          <w:rFonts w:ascii="Times New Roman" w:hAnsi="Times New Roman" w:eastAsia="Times New Roman" w:cs="Times New Roman"/>
+          <w:sz w:val="26"/>
+          <w:szCs w:val="26"/>
+          <w:lang w:val="en-US"/>
+        </w:rPr>
+        <w:t xml:space="preserve">    &lt;/p&gt;</w:t>
+      </w:r>
+    </w:p>
+    <w:p>
+      <w:pPr>
+        <w:spacing w:after="160" w:afterAutospacing="0" w:line="240" w:lineRule="auto"/>
+        <w:ind w:firstLine="720"/>
+        <w:rPr>
+          <w:rFonts w:ascii="Times New Roman" w:hAnsi="Times New Roman" w:eastAsia="Times New Roman" w:cs="Times New Roman"/>
+          <w:sz w:val="26"/>
+          <w:szCs w:val="26"/>
+          <w:lang w:val="en-US"/>
+        </w:rPr>
+      </w:pPr>
+      <w:r>
+        <w:rPr>
+          <w:rFonts w:ascii="Times New Roman" w:hAnsi="Times New Roman" w:eastAsia="Times New Roman" w:cs="Times New Roman"/>
+          <w:sz w:val="26"/>
+          <w:szCs w:val="26"/>
+          <w:lang w:val="en-US"/>
+        </w:rPr>
+        <w:t>&lt;/body&gt;</w:t>
+      </w:r>
+    </w:p>
+    <w:p>
+      <w:pPr>
+        <w:pStyle w:val="26"/>
+        <w:numPr>
+          <w:ilvl w:val="0"/>
+          <w:numId w:val="3"/>
+        </w:numPr>
+        <w:spacing w:after="160" w:afterAutospacing="0" w:line="360" w:lineRule="auto"/>
+        <w:rPr>
+          <w:rFonts w:ascii="Times New Roman" w:hAnsi="Times New Roman" w:eastAsia="Times New Roman" w:cs="Times New Roman"/>
+          <w:sz w:val="26"/>
+          <w:szCs w:val="26"/>
+          <w:lang w:val="en-US"/>
+        </w:rPr>
+      </w:pPr>
+      <w:r>
+        <w:rPr>
+          <w:rFonts w:ascii="Times New Roman" w:hAnsi="Times New Roman" w:eastAsia="Times New Roman" w:cs="Times New Roman"/>
+          <w:sz w:val="26"/>
+          <w:szCs w:val="26"/>
+          <w:lang w:val="en-US"/>
+        </w:rPr>
+        <w:t>Đối với bảng:</w:t>
+      </w:r>
+    </w:p>
+    <w:p>
+      <w:pPr>
+        <w:spacing w:after="160" w:afterAutospacing="0" w:line="240" w:lineRule="auto"/>
+        <w:ind w:firstLine="720"/>
+        <w:rPr>
+          <w:rFonts w:ascii="Times New Roman" w:hAnsi="Times New Roman" w:eastAsia="Times New Roman" w:cs="Times New Roman"/>
+          <w:sz w:val="26"/>
+          <w:szCs w:val="26"/>
+          <w:lang w:val="en-US"/>
+        </w:rPr>
+      </w:pPr>
+      <w:r>
+        <w:rPr>
+          <w:rFonts w:ascii="Times New Roman" w:hAnsi="Times New Roman" w:eastAsia="Times New Roman" w:cs="Times New Roman"/>
+          <w:sz w:val="26"/>
+          <w:szCs w:val="26"/>
+          <w:lang w:val="en-US"/>
+        </w:rPr>
+        <w:t>&lt;body&gt;</w:t>
+      </w:r>
+    </w:p>
+    <w:p>
+      <w:pPr>
+        <w:spacing w:after="160" w:afterAutospacing="0" w:line="240" w:lineRule="auto"/>
+        <w:ind w:firstLine="720"/>
+        <w:rPr>
+          <w:rFonts w:ascii="Times New Roman" w:hAnsi="Times New Roman" w:eastAsia="Times New Roman" w:cs="Times New Roman"/>
+          <w:sz w:val="26"/>
+          <w:szCs w:val="26"/>
+          <w:lang w:val="en-US"/>
+        </w:rPr>
+      </w:pPr>
+      <w:r>
+        <w:rPr>
+          <w:rFonts w:ascii="Times New Roman" w:hAnsi="Times New Roman" w:eastAsia="Times New Roman" w:cs="Times New Roman"/>
+          <w:sz w:val="26"/>
+          <w:szCs w:val="26"/>
+          <w:lang w:val="en-US"/>
+        </w:rPr>
+        <w:t xml:space="preserve">    &lt;table&gt;</w:t>
+      </w:r>
+    </w:p>
+    <w:p>
+      <w:pPr>
+        <w:spacing w:after="160" w:afterAutospacing="0" w:line="240" w:lineRule="auto"/>
+        <w:ind w:firstLine="720"/>
+        <w:rPr>
+          <w:rFonts w:ascii="Times New Roman" w:hAnsi="Times New Roman" w:eastAsia="Times New Roman" w:cs="Times New Roman"/>
+          <w:sz w:val="26"/>
+          <w:szCs w:val="26"/>
+          <w:lang w:val="en-US"/>
+        </w:rPr>
+      </w:pPr>
+      <w:r>
+        <w:rPr>
+          <w:rFonts w:ascii="Times New Roman" w:hAnsi="Times New Roman" w:eastAsia="Times New Roman" w:cs="Times New Roman"/>
+          <w:sz w:val="26"/>
+          <w:szCs w:val="26"/>
+          <w:lang w:val="en-US"/>
+        </w:rPr>
+        <w:t xml:space="preserve">        &lt;tr&gt;</w:t>
+      </w:r>
+    </w:p>
+    <w:p>
+      <w:pPr>
+        <w:spacing w:after="160" w:afterAutospacing="0" w:line="240" w:lineRule="auto"/>
+        <w:ind w:left="1440" w:right="0" w:firstLine="720"/>
+        <w:rPr>
+          <w:rFonts w:ascii="Times New Roman" w:hAnsi="Times New Roman" w:eastAsia="Times New Roman" w:cs="Times New Roman"/>
+          <w:sz w:val="26"/>
+          <w:szCs w:val="26"/>
+          <w:lang w:val="en-US"/>
+        </w:rPr>
+      </w:pPr>
+      <w:r>
+        <w:rPr>
+          <w:rFonts w:ascii="Times New Roman" w:hAnsi="Times New Roman" w:eastAsia="Times New Roman" w:cs="Times New Roman"/>
+          <w:sz w:val="26"/>
+          <w:szCs w:val="26"/>
+          <w:lang w:val="en-US"/>
+        </w:rPr>
+        <w:t>&lt;th&gt;A&lt;/th&gt;</w:t>
+      </w:r>
+    </w:p>
+    <w:p>
+      <w:pPr>
+        <w:spacing w:after="160" w:afterAutospacing="0" w:line="240" w:lineRule="auto"/>
+        <w:ind w:firstLine="720"/>
+        <w:rPr>
+          <w:rFonts w:ascii="Times New Roman" w:hAnsi="Times New Roman" w:eastAsia="Times New Roman" w:cs="Times New Roman"/>
+          <w:sz w:val="26"/>
+          <w:szCs w:val="26"/>
+          <w:lang w:val="en-US"/>
+        </w:rPr>
+      </w:pPr>
+      <w:r>
+        <w:rPr>
+          <w:rFonts w:ascii="Times New Roman" w:hAnsi="Times New Roman" w:eastAsia="Times New Roman" w:cs="Times New Roman"/>
+          <w:sz w:val="26"/>
+          <w:szCs w:val="26"/>
+          <w:lang w:val="en-US"/>
+        </w:rPr>
+        <w:t xml:space="preserve">            </w:t>
+      </w:r>
+      <w:r>
+        <w:tab/>
+      </w:r>
+      <w:r>
+        <w:rPr>
+          <w:rFonts w:ascii="Times New Roman" w:hAnsi="Times New Roman" w:eastAsia="Times New Roman" w:cs="Times New Roman"/>
+          <w:sz w:val="26"/>
+          <w:szCs w:val="26"/>
+          <w:lang w:val="en-US"/>
+        </w:rPr>
+        <w:t>&lt;th&gt;B&lt;/th&gt;</w:t>
+      </w:r>
+    </w:p>
+    <w:p>
+      <w:pPr>
+        <w:spacing w:after="160" w:afterAutospacing="0" w:line="240" w:lineRule="auto"/>
+        <w:ind w:firstLine="720"/>
+        <w:rPr>
+          <w:rFonts w:ascii="Times New Roman" w:hAnsi="Times New Roman" w:eastAsia="Times New Roman" w:cs="Times New Roman"/>
+          <w:sz w:val="26"/>
+          <w:szCs w:val="26"/>
+          <w:lang w:val="en-US"/>
+        </w:rPr>
+      </w:pPr>
+      <w:r>
+        <w:rPr>
+          <w:rFonts w:ascii="Times New Roman" w:hAnsi="Times New Roman" w:eastAsia="Times New Roman" w:cs="Times New Roman"/>
+          <w:sz w:val="26"/>
+          <w:szCs w:val="26"/>
+          <w:lang w:val="en-US"/>
+        </w:rPr>
+        <w:t xml:space="preserve">        &lt;/tr&gt;</w:t>
+      </w:r>
+    </w:p>
+    <w:p>
+      <w:pPr>
+        <w:spacing w:after="160" w:afterAutospacing="0" w:line="240" w:lineRule="auto"/>
+        <w:ind w:firstLine="720"/>
+        <w:rPr>
+          <w:rFonts w:ascii="Times New Roman" w:hAnsi="Times New Roman" w:eastAsia="Times New Roman" w:cs="Times New Roman"/>
+          <w:sz w:val="26"/>
+          <w:szCs w:val="26"/>
+          <w:lang w:val="en-US"/>
+        </w:rPr>
+      </w:pPr>
+      <w:r>
+        <w:rPr>
+          <w:rFonts w:ascii="Times New Roman" w:hAnsi="Times New Roman" w:eastAsia="Times New Roman" w:cs="Times New Roman"/>
+          <w:sz w:val="26"/>
+          <w:szCs w:val="26"/>
+          <w:lang w:val="en-US"/>
+        </w:rPr>
+        <w:t xml:space="preserve">        &lt;tr&gt;</w:t>
+      </w:r>
+    </w:p>
+    <w:p>
+      <w:pPr>
+        <w:spacing w:after="160" w:afterAutospacing="0" w:line="240" w:lineRule="auto"/>
+        <w:ind w:firstLine="720"/>
+        <w:rPr>
+          <w:rFonts w:ascii="Times New Roman" w:hAnsi="Times New Roman" w:eastAsia="Times New Roman" w:cs="Times New Roman"/>
+          <w:sz w:val="26"/>
+          <w:szCs w:val="26"/>
+          <w:lang w:val="en-US"/>
+        </w:rPr>
+      </w:pPr>
+      <w:r>
+        <w:rPr>
+          <w:rFonts w:ascii="Times New Roman" w:hAnsi="Times New Roman" w:eastAsia="Times New Roman" w:cs="Times New Roman"/>
+          <w:sz w:val="26"/>
+          <w:szCs w:val="26"/>
+          <w:lang w:val="en-US"/>
+        </w:rPr>
+        <w:t xml:space="preserve">            &lt;td&gt;a&lt;/td&gt;</w:t>
+      </w:r>
+    </w:p>
+    <w:p>
+      <w:pPr>
+        <w:spacing w:after="160" w:afterAutospacing="0" w:line="240" w:lineRule="auto"/>
+        <w:ind w:firstLine="720"/>
+        <w:rPr>
+          <w:rFonts w:ascii="Times New Roman" w:hAnsi="Times New Roman" w:eastAsia="Times New Roman" w:cs="Times New Roman"/>
+          <w:sz w:val="26"/>
+          <w:szCs w:val="26"/>
+          <w:lang w:val="en-US"/>
+        </w:rPr>
+      </w:pPr>
+      <w:r>
+        <w:rPr>
+          <w:rFonts w:ascii="Times New Roman" w:hAnsi="Times New Roman" w:eastAsia="Times New Roman" w:cs="Times New Roman"/>
+          <w:sz w:val="26"/>
+          <w:szCs w:val="26"/>
+          <w:lang w:val="en-US"/>
+        </w:rPr>
+        <w:t xml:space="preserve">            &lt;td&gt;b&lt;/td&gt;</w:t>
+      </w:r>
+    </w:p>
+    <w:p>
+      <w:pPr>
+        <w:spacing w:after="160" w:afterAutospacing="0" w:line="240" w:lineRule="auto"/>
+        <w:ind w:firstLine="720"/>
+        <w:rPr>
+          <w:rFonts w:ascii="Times New Roman" w:hAnsi="Times New Roman" w:eastAsia="Times New Roman" w:cs="Times New Roman"/>
+          <w:sz w:val="26"/>
+          <w:szCs w:val="26"/>
+          <w:lang w:val="en-US"/>
+        </w:rPr>
+      </w:pPr>
+      <w:r>
+        <w:rPr>
+          <w:rFonts w:ascii="Times New Roman" w:hAnsi="Times New Roman" w:eastAsia="Times New Roman" w:cs="Times New Roman"/>
+          <w:sz w:val="26"/>
+          <w:szCs w:val="26"/>
+          <w:lang w:val="en-US"/>
+        </w:rPr>
+        <w:t xml:space="preserve">        &lt;/tr&gt;</w:t>
+      </w:r>
+    </w:p>
+    <w:p>
+      <w:pPr>
+        <w:spacing w:after="160" w:afterAutospacing="0" w:line="240" w:lineRule="auto"/>
+        <w:ind w:firstLine="720"/>
+        <w:rPr>
+          <w:rFonts w:ascii="Times New Roman" w:hAnsi="Times New Roman" w:eastAsia="Times New Roman" w:cs="Times New Roman"/>
+          <w:sz w:val="26"/>
+          <w:szCs w:val="26"/>
+          <w:lang w:val="en-US"/>
+        </w:rPr>
+      </w:pPr>
+      <w:r>
+        <w:rPr>
+          <w:rFonts w:ascii="Times New Roman" w:hAnsi="Times New Roman" w:eastAsia="Times New Roman" w:cs="Times New Roman"/>
+          <w:sz w:val="26"/>
+          <w:szCs w:val="26"/>
+          <w:lang w:val="en-US"/>
+        </w:rPr>
+        <w:t xml:space="preserve">    &lt;/table&gt;</w:t>
+      </w:r>
+    </w:p>
+    <w:p>
+      <w:pPr>
+        <w:spacing w:after="160" w:afterAutospacing="0" w:line="240" w:lineRule="auto"/>
+        <w:ind w:firstLine="720"/>
+        <w:rPr>
+          <w:rFonts w:ascii="Times New Roman" w:hAnsi="Times New Roman" w:eastAsia="Times New Roman" w:cs="Times New Roman"/>
+          <w:sz w:val="26"/>
+          <w:szCs w:val="26"/>
+          <w:lang w:val="en-US"/>
+        </w:rPr>
+      </w:pPr>
+      <w:r>
+        <w:rPr>
+          <w:rFonts w:ascii="Times New Roman" w:hAnsi="Times New Roman" w:eastAsia="Times New Roman" w:cs="Times New Roman"/>
+          <w:sz w:val="26"/>
+          <w:szCs w:val="26"/>
+          <w:lang w:val="en-US"/>
+        </w:rPr>
+        <w:t>&lt;/body&gt;</w:t>
+      </w:r>
+    </w:p>
+    <w:p>
+      <w:pPr>
+        <w:pStyle w:val="26"/>
+        <w:numPr>
+          <w:ilvl w:val="0"/>
+          <w:numId w:val="4"/>
+        </w:numPr>
+        <w:spacing w:after="160" w:afterAutospacing="0" w:line="360" w:lineRule="auto"/>
+        <w:rPr>
+          <w:rFonts w:ascii="Times New Roman" w:hAnsi="Times New Roman" w:eastAsia="Times New Roman" w:cs="Times New Roman"/>
+          <w:sz w:val="26"/>
+          <w:szCs w:val="26"/>
+          <w:lang w:val="en-US"/>
+        </w:rPr>
+      </w:pPr>
+      <w:r>
+        <w:rPr>
+          <w:rFonts w:ascii="Times New Roman" w:hAnsi="Times New Roman" w:eastAsia="Times New Roman" w:cs="Times New Roman"/>
+          <w:sz w:val="26"/>
+          <w:szCs w:val="26"/>
+          <w:lang w:val="en-US"/>
+        </w:rPr>
+        <w:t>Đối với danh sách:</w:t>
+      </w:r>
+    </w:p>
+    <w:p>
+      <w:pPr>
+        <w:spacing w:after="160" w:afterAutospacing="0" w:line="240" w:lineRule="auto"/>
+        <w:ind w:firstLine="720"/>
+        <w:rPr>
+          <w:rFonts w:ascii="Times New Roman" w:hAnsi="Times New Roman" w:eastAsia="Times New Roman" w:cs="Times New Roman"/>
+          <w:sz w:val="26"/>
+          <w:szCs w:val="26"/>
+          <w:lang w:val="en-US"/>
+        </w:rPr>
+      </w:pPr>
+      <w:r>
+        <w:rPr>
+          <w:rFonts w:ascii="Times New Roman" w:hAnsi="Times New Roman" w:eastAsia="Times New Roman" w:cs="Times New Roman"/>
+          <w:sz w:val="26"/>
+          <w:szCs w:val="26"/>
+          <w:lang w:val="en-US"/>
+        </w:rPr>
+        <w:t>&lt;ul&gt;</w:t>
+      </w:r>
+    </w:p>
+    <w:p>
+      <w:pPr>
+        <w:spacing w:after="160" w:afterAutospacing="0" w:line="240" w:lineRule="auto"/>
+        <w:ind w:firstLine="720"/>
+        <w:rPr>
+          <w:rFonts w:ascii="Times New Roman" w:hAnsi="Times New Roman" w:eastAsia="Times New Roman" w:cs="Times New Roman"/>
+          <w:sz w:val="26"/>
+          <w:szCs w:val="26"/>
+          <w:lang w:val="en-US"/>
+        </w:rPr>
+      </w:pPr>
+      <w:r>
+        <w:rPr>
+          <w:rFonts w:ascii="Times New Roman" w:hAnsi="Times New Roman" w:eastAsia="Times New Roman" w:cs="Times New Roman"/>
+          <w:sz w:val="26"/>
+          <w:szCs w:val="26"/>
+          <w:lang w:val="en-US"/>
+        </w:rPr>
+        <w:t xml:space="preserve">    &lt;li&gt;Tên&lt;/li&gt;</w:t>
+      </w:r>
+    </w:p>
+    <w:p>
+      <w:pPr>
+        <w:spacing w:after="160" w:afterAutospacing="0" w:line="240" w:lineRule="auto"/>
+        <w:ind w:firstLine="720"/>
+        <w:rPr>
+          <w:rFonts w:ascii="Times New Roman" w:hAnsi="Times New Roman" w:eastAsia="Times New Roman" w:cs="Times New Roman"/>
+          <w:sz w:val="26"/>
+          <w:szCs w:val="26"/>
+          <w:lang w:val="en-US"/>
+        </w:rPr>
+      </w:pPr>
+      <w:r>
+        <w:rPr>
+          <w:rFonts w:ascii="Times New Roman" w:hAnsi="Times New Roman" w:eastAsia="Times New Roman" w:cs="Times New Roman"/>
+          <w:sz w:val="26"/>
+          <w:szCs w:val="26"/>
+          <w:lang w:val="en-US"/>
+        </w:rPr>
+        <w:t xml:space="preserve">    &lt;li&gt;Lớp&lt;/li&gt;</w:t>
+      </w:r>
+    </w:p>
+    <w:p>
+      <w:pPr>
+        <w:spacing w:after="160" w:afterAutospacing="0" w:line="240" w:lineRule="auto"/>
+        <w:ind w:firstLine="720"/>
+        <w:rPr>
+          <w:rFonts w:ascii="Times New Roman" w:hAnsi="Times New Roman" w:eastAsia="Times New Roman" w:cs="Times New Roman"/>
+          <w:sz w:val="26"/>
+          <w:szCs w:val="26"/>
+          <w:lang w:val="en-US"/>
+        </w:rPr>
+      </w:pPr>
+      <w:r>
+        <w:rPr>
+          <w:rFonts w:ascii="Times New Roman" w:hAnsi="Times New Roman" w:eastAsia="Times New Roman" w:cs="Times New Roman"/>
+          <w:sz w:val="26"/>
+          <w:szCs w:val="26"/>
+          <w:lang w:val="en-US"/>
+        </w:rPr>
+        <w:t>&lt;/ul&gt;</w:t>
       </w:r>
     </w:p>
     <w:p>
@@ -5457,11 +6044,11 @@
           <w:numId w:val="0"/>
         </w:numPr>
       </w:pPr>
-      <w:bookmarkStart w:id="23" w:name="_Toc231633282"/>
+      <w:bookmarkStart w:id="24" w:name="_Toc231633282"/>
       <w:r>
         <w:t>2.2.4   Các thẻ cơ bản trong HTML</w:t>
       </w:r>
-      <w:bookmarkEnd w:id="23"/>
+      <w:bookmarkEnd w:id="24"/>
     </w:p>
     <w:p>
       <w:pPr>
@@ -5597,11 +6184,11 @@
           <w:numId w:val="0"/>
         </w:numPr>
       </w:pPr>
-      <w:bookmarkStart w:id="24" w:name="_Toc231633283"/>
+      <w:bookmarkStart w:id="25" w:name="_Toc231633283"/>
       <w:r>
         <w:t>2.2.5   Các thẻ định dạng thành phần web HTML</w:t>
       </w:r>
-      <w:bookmarkEnd w:id="24"/>
+      <w:bookmarkEnd w:id="25"/>
     </w:p>
     <w:p>
       <w:pPr>
@@ -5674,11 +6261,11 @@
           <w:numId w:val="0"/>
         </w:numPr>
       </w:pPr>
-      <w:bookmarkStart w:id="25" w:name="_Toc231633284"/>
+      <w:bookmarkStart w:id="26" w:name="_Toc231633284"/>
       <w:r>
         <w:t>2.2.6   Các thẻ định dạng nội dung văn bản</w:t>
       </w:r>
-      <w:bookmarkEnd w:id="25"/>
+      <w:bookmarkEnd w:id="26"/>
     </w:p>
     <w:p>
       <w:pPr>
@@ -5832,11 +6419,11 @@
           <w:numId w:val="0"/>
         </w:numPr>
       </w:pPr>
-      <w:bookmarkStart w:id="26" w:name="_Toc231633285"/>
+      <w:bookmarkStart w:id="27" w:name="_Toc231633285"/>
       <w:r>
         <w:t>2.2.7   Các thẻ định dạng bảng</w:t>
       </w:r>
-      <w:bookmarkEnd w:id="26"/>
+      <w:bookmarkEnd w:id="27"/>
     </w:p>
     <w:p>
       <w:pPr>
@@ -5936,11 +6523,11 @@
           <w:numId w:val="0"/>
         </w:numPr>
       </w:pPr>
-      <w:bookmarkStart w:id="27" w:name="_Toc231633286"/>
+      <w:bookmarkStart w:id="28" w:name="_Toc231633286"/>
       <w:r>
         <w:t>2.2.8   Các thẻ danh sách</w:t>
       </w:r>
-      <w:bookmarkEnd w:id="27"/>
+      <w:bookmarkEnd w:id="28"/>
     </w:p>
     <w:p>
       <w:pPr>
@@ -6043,11 +6630,11 @@
           <w:rFonts w:eastAsia="Times New Roman" w:cs="Times New Roman"/>
         </w:rPr>
       </w:pPr>
-      <w:bookmarkStart w:id="28" w:name="_Toc231633287"/>
+      <w:bookmarkStart w:id="29" w:name="_Toc231633287"/>
       <w:r>
         <w:t>2.2.9   Các thẻ đa phương tiện</w:t>
       </w:r>
-      <w:bookmarkEnd w:id="28"/>
+      <w:bookmarkEnd w:id="29"/>
     </w:p>
     <w:p>
       <w:pPr>
@@ -6135,11 +6722,11 @@
           <w:rFonts w:eastAsia="Times New Roman" w:cs="Times New Roman"/>
         </w:rPr>
       </w:pPr>
-      <w:bookmarkStart w:id="29" w:name="_Toc231633288"/>
+      <w:bookmarkStart w:id="30" w:name="_Toc231633288"/>
       <w:r>
         <w:t>2.2.10   Các thẻ liên kết</w:t>
       </w:r>
-      <w:bookmarkEnd w:id="29"/>
+      <w:bookmarkEnd w:id="30"/>
     </w:p>
     <w:p>
       <w:pPr>
@@ -6182,11 +6769,11 @@
           <w:rFonts w:eastAsia="Times New Roman" w:cs="Times New Roman"/>
         </w:rPr>
       </w:pPr>
-      <w:bookmarkStart w:id="30" w:name="_Toc231633289"/>
+      <w:bookmarkStart w:id="31" w:name="_Toc231633289"/>
       <w:r>
         <w:t>2.2.11   Các thẻ thông dụng trong HTML</w:t>
       </w:r>
-      <w:bookmarkEnd w:id="30"/>
+      <w:bookmarkEnd w:id="31"/>
     </w:p>
     <w:p>
       <w:pPr>
@@ -6351,11 +6938,11 @@
           <w:rFonts w:eastAsia="Times New Roman" w:cs="Times New Roman"/>
         </w:rPr>
       </w:pPr>
-      <w:bookmarkStart w:id="31" w:name="_Toc231633290"/>
+      <w:bookmarkStart w:id="32" w:name="_Toc231633290"/>
       <w:r>
         <w:t>2.3   Ngôn ngữ CSS</w:t>
       </w:r>
-      <w:bookmarkEnd w:id="31"/>
+      <w:bookmarkEnd w:id="32"/>
     </w:p>
     <w:p>
       <w:pPr>
@@ -6368,11 +6955,11 @@
           <w:rFonts w:eastAsia="Times New Roman" w:cs="Times New Roman"/>
         </w:rPr>
       </w:pPr>
-      <w:bookmarkStart w:id="32" w:name="_Toc231633291"/>
+      <w:bookmarkStart w:id="33" w:name="_Toc231633291"/>
       <w:r>
         <w:t>2.3.1   Ngôn ngữ CSS là gì?</w:t>
       </w:r>
-      <w:bookmarkEnd w:id="32"/>
+      <w:bookmarkEnd w:id="33"/>
     </w:p>
     <w:p>
       <w:pPr>
@@ -6412,11 +6999,11 @@
           <w:rFonts w:eastAsia="Times New Roman" w:cs="Times New Roman"/>
         </w:rPr>
       </w:pPr>
-      <w:bookmarkStart w:id="33" w:name="_Toc231633292"/>
+      <w:bookmarkStart w:id="34" w:name="_Toc231633292"/>
       <w:r>
         <w:t>2.3.2   CSS trong cấu trúc HTML</w:t>
       </w:r>
-      <w:bookmarkEnd w:id="33"/>
+      <w:bookmarkEnd w:id="34"/>
     </w:p>
     <w:p>
       <w:pPr>
@@ -6466,7 +7053,7 @@
         <w:pStyle w:val="26"/>
         <w:numPr>
           <w:ilvl w:val="0"/>
-          <w:numId w:val="2"/>
+          <w:numId w:val="5"/>
         </w:numPr>
         <w:spacing w:after="0" w:line="360" w:lineRule="auto"/>
         <w:rPr>
@@ -6499,7 +7086,7 @@
         <w:pStyle w:val="26"/>
         <w:numPr>
           <w:ilvl w:val="0"/>
-          <w:numId w:val="2"/>
+          <w:numId w:val="5"/>
         </w:numPr>
         <w:spacing w:after="0" w:line="360" w:lineRule="auto"/>
         <w:rPr>
@@ -6518,7 +7105,7 @@
         <w:pStyle w:val="26"/>
         <w:numPr>
           <w:ilvl w:val="0"/>
-          <w:numId w:val="2"/>
+          <w:numId w:val="5"/>
         </w:numPr>
         <w:spacing w:after="0" w:line="360" w:lineRule="auto"/>
         <w:rPr>
@@ -6537,7 +7124,7 @@
         <w:pStyle w:val="26"/>
         <w:numPr>
           <w:ilvl w:val="0"/>
-          <w:numId w:val="2"/>
+          <w:numId w:val="5"/>
         </w:numPr>
         <w:spacing w:after="0" w:line="360" w:lineRule="auto"/>
         <w:rPr>
@@ -6556,7 +7143,7 @@
         <w:pStyle w:val="26"/>
         <w:numPr>
           <w:ilvl w:val="0"/>
-          <w:numId w:val="2"/>
+          <w:numId w:val="5"/>
         </w:numPr>
         <w:spacing w:after="0" w:line="360" w:lineRule="auto"/>
         <w:rPr>
@@ -6575,7 +7162,7 @@
         <w:pStyle w:val="26"/>
         <w:numPr>
           <w:ilvl w:val="0"/>
-          <w:numId w:val="2"/>
+          <w:numId w:val="5"/>
         </w:numPr>
         <w:spacing w:after="0" w:line="360" w:lineRule="auto"/>
         <w:rPr>
@@ -6594,7 +7181,7 @@
         <w:pStyle w:val="26"/>
         <w:numPr>
           <w:ilvl w:val="0"/>
-          <w:numId w:val="2"/>
+          <w:numId w:val="5"/>
         </w:numPr>
         <w:spacing w:after="0" w:line="360" w:lineRule="auto"/>
         <w:rPr>
@@ -6626,11 +7213,11 @@
           <w:numId w:val="0"/>
         </w:numPr>
       </w:pPr>
-      <w:bookmarkStart w:id="34" w:name="_Toc231633293"/>
+      <w:bookmarkStart w:id="35" w:name="_Toc231633293"/>
       <w:r>
         <w:t>2.3.3   Bảng định kiểu CSS</w:t>
       </w:r>
-      <w:bookmarkEnd w:id="34"/>
+      <w:bookmarkEnd w:id="35"/>
     </w:p>
     <w:p>
       <w:pPr>
@@ -6677,14 +7264,14 @@
       <w:r>
         <w:fldChar w:fldCharType="end"/>
       </w:r>
-      <w:bookmarkStart w:id="35" w:name="_Toc18866"/>
+      <w:bookmarkStart w:id="36" w:name="_Toc18866"/>
       <w:r>
         <w:rPr>
           <w:lang w:val="en-US"/>
         </w:rPr>
         <w:t xml:space="preserve"> Bộ chọn</w:t>
       </w:r>
-      <w:bookmarkEnd w:id="35"/>
+      <w:bookmarkEnd w:id="36"/>
     </w:p>
     <w:tbl>
       <w:tblPr>
@@ -7447,14 +8034,14 @@
       <w:r>
         <w:fldChar w:fldCharType="end"/>
       </w:r>
-      <w:bookmarkStart w:id="36" w:name="_Toc12922"/>
+      <w:bookmarkStart w:id="37" w:name="_Toc12922"/>
       <w:r>
         <w:rPr>
           <w:lang w:val="en-US"/>
         </w:rPr>
         <w:t xml:space="preserve"> Thuộc tính CSS</w:t>
       </w:r>
-      <w:bookmarkEnd w:id="36"/>
+      <w:bookmarkEnd w:id="37"/>
     </w:p>
     <w:tbl>
       <w:tblPr>
@@ -8900,12 +9487,6 @@
             <w:insideH w:val="single" w:color="auto" w:sz="4" w:space="0"/>
             <w:insideV w:val="single" w:color="auto" w:sz="4" w:space="0"/>
           </w:tblBorders>
-          <w:tblCellMar>
-            <w:top w:w="0" w:type="dxa"/>
-            <w:left w:w="108" w:type="dxa"/>
-            <w:bottom w:w="0" w:type="dxa"/>
-            <w:right w:w="108" w:type="dxa"/>
-          </w:tblCellMar>
         </w:tblPrEx>
         <w:trPr>
           <w:trHeight w:val="504" w:hRule="atLeast"/>
@@ -9572,12 +10153,6 @@
             <w:insideH w:val="single" w:color="auto" w:sz="4" w:space="0"/>
             <w:insideV w:val="single" w:color="auto" w:sz="4" w:space="0"/>
           </w:tblBorders>
-          <w:tblCellMar>
-            <w:top w:w="0" w:type="dxa"/>
-            <w:left w:w="108" w:type="dxa"/>
-            <w:bottom w:w="0" w:type="dxa"/>
-            <w:right w:w="108" w:type="dxa"/>
-          </w:tblCellMar>
         </w:tblPrEx>
         <w:trPr>
           <w:trHeight w:val="504" w:hRule="atLeast"/>
@@ -10935,11 +11510,11 @@
           <w:rFonts w:eastAsia="Times New Roman" w:cs="Times New Roman"/>
         </w:rPr>
       </w:pPr>
-      <w:bookmarkStart w:id="37" w:name="_Toc231633294"/>
+      <w:bookmarkStart w:id="38" w:name="_Toc231633294"/>
       <w:r>
         <w:t>2.4   Ngôn ngữ JavaScript</w:t>
       </w:r>
-      <w:bookmarkEnd w:id="37"/>
+      <w:bookmarkEnd w:id="38"/>
     </w:p>
     <w:p>
       <w:pPr>
@@ -10954,11 +11529,11 @@
           <w:szCs w:val="28"/>
         </w:rPr>
       </w:pPr>
-      <w:bookmarkStart w:id="38" w:name="_Toc231633295"/>
+      <w:bookmarkStart w:id="39" w:name="_Toc231633295"/>
       <w:r>
         <w:t>2.4.1   Ngôn ngữ JavaScript là gì?</w:t>
       </w:r>
-      <w:bookmarkEnd w:id="38"/>
+      <w:bookmarkEnd w:id="39"/>
     </w:p>
     <w:p>
       <w:pPr>
@@ -10991,7 +11566,298 @@
         <w:rPr>
           <w:rFonts w:eastAsia="Times New Roman" w:cs="Times New Roman"/>
         </w:rPr>
-        <w:t>Tất cả những đoạn mã javascript đều được đặt trong cặp thẻ &lt;script&gt;&lt;/script&gt;. Cặp thẻ đặt trong phần head của html.</w:t>
+        <w:t>Tất cả những đoạn mã javascript đều được đặt trong cặp thẻ &lt;script&gt;</w:t>
+      </w:r>
+      <w:r>
+        <w:tab/>
+      </w:r>
+      <w:r>
+        <w:tab/>
+      </w:r>
+      <w:r>
+        <w:rPr>
+          <w:rFonts w:eastAsia="Times New Roman" w:cs="Times New Roman"/>
+        </w:rPr>
+        <w:t>&lt;/script&gt;.</w:t>
+      </w:r>
+    </w:p>
+    <w:p>
+      <w:pPr>
+        <w:spacing w:after="120" w:line="360" w:lineRule="auto"/>
+        <w:ind w:firstLine="720"/>
+        <w:jc w:val="both"/>
+        <w:rPr>
+          <w:rFonts w:eastAsia="Times New Roman" w:cs="Times New Roman"/>
+          <w:sz w:val="26"/>
+          <w:szCs w:val="26"/>
+        </w:rPr>
+      </w:pPr>
+      <w:r>
+        <w:rPr>
+          <w:rFonts w:eastAsia="Times New Roman" w:cs="Times New Roman"/>
+          <w:sz w:val="26"/>
+          <w:szCs w:val="26"/>
+        </w:rPr>
+        <w:t>Ví dụ:</w:t>
+      </w:r>
+    </w:p>
+    <w:p>
+      <w:pPr>
+        <w:spacing w:after="120" w:line="240" w:lineRule="auto"/>
+        <w:ind w:firstLine="720"/>
+        <w:jc w:val="both"/>
+        <w:rPr>
+          <w:rFonts w:ascii="Times New Roman" w:hAnsi="Times New Roman" w:eastAsia="Times New Roman" w:cs="Times New Roman"/>
+          <w:color w:val="auto"/>
+          <w:sz w:val="26"/>
+          <w:szCs w:val="26"/>
+          <w:lang w:val="en-US"/>
+        </w:rPr>
+      </w:pPr>
+      <w:r>
+        <w:rPr>
+          <w:rFonts w:ascii="Times New Roman" w:hAnsi="Times New Roman" w:eastAsia="Times New Roman" w:cs="Times New Roman"/>
+          <w:b w:val="0"/>
+          <w:bCs w:val="0"/>
+          <w:i w:val="0"/>
+          <w:iCs w:val="0"/>
+          <w:caps w:val="0"/>
+          <w:smallCaps w:val="0"/>
+          <w:color w:val="auto"/>
+          <w:sz w:val="26"/>
+          <w:szCs w:val="26"/>
+          <w:lang w:val="en-US"/>
+        </w:rPr>
+        <w:t>&lt;script&gt;</w:t>
+      </w:r>
+      <w:r>
+        <w:br w:type="textWrapping"/>
+      </w:r>
+      <w:r>
+        <w:br w:type="textWrapping"/>
+      </w:r>
+      <w:r>
+        <w:rPr>
+          <w:rFonts w:ascii="Times New Roman" w:hAnsi="Times New Roman" w:eastAsia="Times New Roman" w:cs="Times New Roman"/>
+          <w:b w:val="0"/>
+          <w:bCs w:val="0"/>
+          <w:i w:val="0"/>
+          <w:iCs w:val="0"/>
+          <w:caps w:val="0"/>
+          <w:smallCaps w:val="0"/>
+          <w:color w:val="auto"/>
+          <w:sz w:val="26"/>
+          <w:szCs w:val="26"/>
+          <w:lang w:val="en-US"/>
+        </w:rPr>
+        <w:t xml:space="preserve">    </w:t>
+      </w:r>
+      <w:r>
+        <w:tab/>
+      </w:r>
+      <w:r>
+        <w:tab/>
+      </w:r>
+      <w:r>
+        <w:rPr>
+          <w:rFonts w:ascii="Times New Roman" w:hAnsi="Times New Roman" w:eastAsia="Times New Roman" w:cs="Times New Roman"/>
+          <w:b w:val="0"/>
+          <w:bCs w:val="0"/>
+          <w:i w:val="0"/>
+          <w:iCs w:val="0"/>
+          <w:caps w:val="0"/>
+          <w:smallCaps w:val="0"/>
+          <w:color w:val="auto"/>
+          <w:sz w:val="26"/>
+          <w:szCs w:val="26"/>
+          <w:lang w:val="en-US"/>
+        </w:rPr>
+        <w:t>alert("HelloWorld!");</w:t>
+      </w:r>
+      <w:r>
+        <w:br w:type="textWrapping"/>
+      </w:r>
+      <w:r>
+        <w:br w:type="textWrapping"/>
+      </w:r>
+      <w:r>
+        <w:tab/>
+      </w:r>
+      <w:r>
+        <w:rPr>
+          <w:rFonts w:ascii="Times New Roman" w:hAnsi="Times New Roman" w:eastAsia="Times New Roman" w:cs="Times New Roman"/>
+          <w:b w:val="0"/>
+          <w:bCs w:val="0"/>
+          <w:i w:val="0"/>
+          <w:iCs w:val="0"/>
+          <w:caps w:val="0"/>
+          <w:smallCaps w:val="0"/>
+          <w:color w:val="auto"/>
+          <w:sz w:val="26"/>
+          <w:szCs w:val="26"/>
+          <w:lang w:val="en-US"/>
+        </w:rPr>
+        <w:t>&lt;/script&gt;</w:t>
+      </w:r>
+    </w:p>
+    <w:p>
+      <w:pPr>
+        <w:pStyle w:val="26"/>
+        <w:numPr>
+          <w:ilvl w:val="0"/>
+          <w:numId w:val="2"/>
+        </w:numPr>
+        <w:jc w:val="both"/>
+        <w:rPr>
+          <w:rFonts w:ascii="Times New Roman" w:hAnsi="Times New Roman" w:eastAsia="Times New Roman" w:cs="Times New Roman"/>
+          <w:sz w:val="26"/>
+          <w:szCs w:val="26"/>
+          <w:lang w:val="en-US"/>
+        </w:rPr>
+      </w:pPr>
+      <w:r>
+        <w:rPr>
+          <w:rFonts w:ascii="Times New Roman" w:hAnsi="Times New Roman" w:eastAsia="Times New Roman" w:cs="Times New Roman"/>
+          <w:sz w:val="26"/>
+          <w:szCs w:val="26"/>
+          <w:lang w:val="en-US"/>
+        </w:rPr>
+        <w:t>Ưu điểm của Javascript</w:t>
+      </w:r>
+    </w:p>
+    <w:p>
+      <w:pPr>
+        <w:spacing w:before="0" w:beforeAutospacing="0" w:after="0" w:afterAutospacing="0"/>
+        <w:ind w:left="1440"/>
+        <w:jc w:val="both"/>
+        <w:rPr>
+          <w:rFonts w:ascii="Times New Roman" w:hAnsi="Times New Roman" w:eastAsia="Times New Roman" w:cs="Times New Roman"/>
+          <w:sz w:val="26"/>
+          <w:szCs w:val="26"/>
+          <w:lang w:val="en-US"/>
+        </w:rPr>
+      </w:pPr>
+      <w:r>
+        <w:rPr>
+          <w:rFonts w:ascii="Times New Roman" w:hAnsi="Times New Roman" w:eastAsia="Times New Roman" w:cs="Times New Roman"/>
+          <w:sz w:val="26"/>
+          <w:szCs w:val="26"/>
+          <w:lang w:val="en-US"/>
+        </w:rPr>
+        <w:t>Ít tương tác với máy chủ</w:t>
+      </w:r>
+    </w:p>
+    <w:p>
+      <w:pPr>
+        <w:spacing w:before="0" w:beforeAutospacing="0" w:after="0" w:afterAutospacing="0"/>
+        <w:ind w:left="1440"/>
+        <w:jc w:val="both"/>
+        <w:rPr>
+          <w:rFonts w:ascii="Times New Roman" w:hAnsi="Times New Roman" w:eastAsia="Times New Roman" w:cs="Times New Roman"/>
+          <w:sz w:val="26"/>
+          <w:szCs w:val="26"/>
+          <w:lang w:val="en-US"/>
+        </w:rPr>
+      </w:pPr>
+      <w:r>
+        <w:rPr>
+          <w:rFonts w:ascii="Times New Roman" w:hAnsi="Times New Roman" w:eastAsia="Times New Roman" w:cs="Times New Roman"/>
+          <w:sz w:val="26"/>
+          <w:szCs w:val="26"/>
+          <w:lang w:val="en-US"/>
+        </w:rPr>
+        <w:t>Phản hồi ngay lập tức tới người dùng</w:t>
+      </w:r>
+    </w:p>
+    <w:p>
+      <w:pPr>
+        <w:spacing w:before="0" w:beforeAutospacing="0" w:after="0" w:afterAutospacing="0"/>
+        <w:ind w:left="1440"/>
+        <w:jc w:val="both"/>
+        <w:rPr>
+          <w:rFonts w:ascii="Times New Roman" w:hAnsi="Times New Roman" w:eastAsia="Times New Roman" w:cs="Times New Roman"/>
+          <w:sz w:val="26"/>
+          <w:szCs w:val="26"/>
+          <w:lang w:val="en-US"/>
+        </w:rPr>
+      </w:pPr>
+      <w:r>
+        <w:rPr>
+          <w:rFonts w:ascii="Times New Roman" w:hAnsi="Times New Roman" w:eastAsia="Times New Roman" w:cs="Times New Roman"/>
+          <w:sz w:val="26"/>
+          <w:szCs w:val="26"/>
+          <w:lang w:val="en-US"/>
+        </w:rPr>
+        <w:t>Tăng cường tương tác</w:t>
+      </w:r>
+    </w:p>
+    <w:p>
+      <w:pPr>
+        <w:spacing w:before="0" w:beforeAutospacing="0" w:after="0" w:afterAutospacing="0"/>
+        <w:ind w:left="1440"/>
+        <w:jc w:val="both"/>
+        <w:rPr>
+          <w:rFonts w:ascii="Times New Roman" w:hAnsi="Times New Roman" w:eastAsia="Times New Roman" w:cs="Times New Roman"/>
+          <w:sz w:val="26"/>
+          <w:szCs w:val="26"/>
+          <w:lang w:val="en-US"/>
+        </w:rPr>
+      </w:pPr>
+      <w:r>
+        <w:rPr>
+          <w:rFonts w:ascii="Times New Roman" w:hAnsi="Times New Roman" w:eastAsia="Times New Roman" w:cs="Times New Roman"/>
+          <w:sz w:val="26"/>
+          <w:szCs w:val="26"/>
+          <w:lang w:val="en-US"/>
+        </w:rPr>
+        <w:t>Giao diện mạnh mẽ hơn</w:t>
+      </w:r>
+    </w:p>
+    <w:p>
+      <w:pPr>
+        <w:pStyle w:val="26"/>
+        <w:numPr>
+          <w:ilvl w:val="0"/>
+          <w:numId w:val="2"/>
+        </w:numPr>
+        <w:jc w:val="both"/>
+        <w:rPr>
+          <w:rFonts w:ascii="Times New Roman" w:hAnsi="Times New Roman" w:eastAsia="Times New Roman" w:cs="Times New Roman"/>
+          <w:sz w:val="26"/>
+          <w:szCs w:val="26"/>
+          <w:lang w:val="en-US"/>
+        </w:rPr>
+      </w:pPr>
+      <w:r>
+        <w:rPr>
+          <w:rFonts w:ascii="Times New Roman" w:hAnsi="Times New Roman" w:eastAsia="Times New Roman" w:cs="Times New Roman"/>
+          <w:sz w:val="26"/>
+          <w:szCs w:val="26"/>
+          <w:lang w:val="en-US"/>
+        </w:rPr>
+        <w:t>Nhược điểm của Javascript</w:t>
+      </w:r>
+    </w:p>
+    <w:p>
+      <w:pPr>
+        <w:spacing w:before="0" w:beforeAutospacing="0" w:after="0" w:afterAutospacing="0"/>
+        <w:ind w:left="1440"/>
+        <w:jc w:val="both"/>
+        <w:rPr>
+          <w:rFonts w:ascii="Times New Roman" w:hAnsi="Times New Roman" w:eastAsia="Times New Roman" w:cs="Times New Roman"/>
+          <w:sz w:val="26"/>
+          <w:szCs w:val="26"/>
+          <w:lang w:val="en-US"/>
+        </w:rPr>
+      </w:pPr>
+      <w:r>
+        <w:rPr>
+          <w:rFonts w:ascii="Times New Roman" w:hAnsi="Times New Roman" w:eastAsia="Times New Roman" w:cs="Times New Roman"/>
+          <w:sz w:val="26"/>
+          <w:szCs w:val="26"/>
+          <w:lang w:val="en-US"/>
+        </w:rPr>
+        <w:t>Javascript không hỗ trợ tạo các ứng dụng mạng, không có tính năng đa luồng và đa xử lý.</w:t>
       </w:r>
     </w:p>
     <w:p>
@@ -11005,18 +11871,18 @@
           <w:rFonts w:eastAsia="Times New Roman" w:cs="Times New Roman"/>
         </w:rPr>
       </w:pPr>
-      <w:bookmarkStart w:id="39" w:name="_Toc231633296"/>
+      <w:bookmarkStart w:id="40" w:name="_Toc231633296"/>
       <w:r>
         <w:t>2.4.2   Một số quy tắt cần tuân thủ của JavaScipt</w:t>
       </w:r>
-      <w:bookmarkEnd w:id="39"/>
+      <w:bookmarkEnd w:id="40"/>
     </w:p>
     <w:p>
       <w:pPr>
         <w:pStyle w:val="26"/>
         <w:numPr>
           <w:ilvl w:val="0"/>
-          <w:numId w:val="2"/>
+          <w:numId w:val="5"/>
         </w:numPr>
         <w:spacing w:line="360" w:lineRule="auto"/>
         <w:jc w:val="both"/>
@@ -11036,7 +11902,7 @@
         <w:pStyle w:val="26"/>
         <w:numPr>
           <w:ilvl w:val="0"/>
-          <w:numId w:val="2"/>
+          <w:numId w:val="5"/>
         </w:numPr>
         <w:spacing w:line="360" w:lineRule="auto"/>
         <w:jc w:val="both"/>
@@ -11056,7 +11922,7 @@
         <w:pStyle w:val="26"/>
         <w:numPr>
           <w:ilvl w:val="0"/>
-          <w:numId w:val="2"/>
+          <w:numId w:val="5"/>
         </w:numPr>
         <w:spacing w:line="360" w:lineRule="auto"/>
         <w:jc w:val="both"/>
@@ -11076,7 +11942,7 @@
         <w:pStyle w:val="26"/>
         <w:numPr>
           <w:ilvl w:val="0"/>
-          <w:numId w:val="2"/>
+          <w:numId w:val="5"/>
         </w:numPr>
         <w:spacing w:line="360" w:lineRule="auto"/>
         <w:jc w:val="both"/>
@@ -11093,16 +11959,12 @@
     </w:p>
     <w:p>
       <w:pPr>
-        <w:spacing w:line="360" w:lineRule="auto"/>
-        <w:jc w:val="both"/>
-        <w:rPr>
-          <w:rFonts w:eastAsia="Times New Roman" w:cs="Times New Roman"/>
-        </w:rPr>
-      </w:pPr>
-    </w:p>
-    <w:p>
-      <w:pPr>
-        <w:spacing w:line="360" w:lineRule="auto"/>
+        <w:pStyle w:val="5"/>
+        <w:numPr>
+          <w:ilvl w:val="0"/>
+          <w:numId w:val="0"/>
+        </w:numPr>
+        <w:ind w:left="0"/>
       </w:pPr>
     </w:p>
     <w:p>
@@ -11129,25 +11991,25 @@
       <w:pPr>
         <w:pStyle w:val="2"/>
       </w:pPr>
-      <w:bookmarkStart w:id="40" w:name="_Toc231633297"/>
+      <w:bookmarkStart w:id="41" w:name="_Toc231633297"/>
       <w:r>
         <w:t>PHÂN TÍCH THIẾT KẾ HỆ THỐNG</w:t>
       </w:r>
-      <w:bookmarkEnd w:id="40"/>
+      <w:bookmarkEnd w:id="41"/>
     </w:p>
     <w:p>
       <w:pPr>
         <w:pStyle w:val="3"/>
       </w:pPr>
-      <w:bookmarkStart w:id="41" w:name="_Toc230160110"/>
       <w:bookmarkStart w:id="42" w:name="_Toc1877128575"/>
-      <w:bookmarkStart w:id="43" w:name="_Toc231633298"/>
+      <w:bookmarkStart w:id="43" w:name="_Toc230160110"/>
+      <w:bookmarkStart w:id="44" w:name="_Toc231633298"/>
       <w:r>
         <w:t>Mô tả vấn đề</w:t>
       </w:r>
-      <w:bookmarkEnd w:id="41"/>
       <w:bookmarkEnd w:id="42"/>
       <w:bookmarkEnd w:id="43"/>
+      <w:bookmarkEnd w:id="44"/>
     </w:p>
     <w:p>
       <w:pPr>
@@ -11181,29 +12043,29 @@
       <w:pPr>
         <w:pStyle w:val="3"/>
       </w:pPr>
-      <w:bookmarkStart w:id="44" w:name="_Toc230160111"/>
       <w:bookmarkStart w:id="45" w:name="_Toc231633299"/>
-      <w:bookmarkStart w:id="46" w:name="_Toc1918015827"/>
+      <w:bookmarkStart w:id="46" w:name="_Toc230160111"/>
+      <w:bookmarkStart w:id="47" w:name="_Toc1918015827"/>
       <w:r>
         <w:t>Đặc tả yêu cầu hệ thống</w:t>
       </w:r>
-      <w:bookmarkEnd w:id="44"/>
       <w:bookmarkEnd w:id="45"/>
       <w:bookmarkEnd w:id="46"/>
+      <w:bookmarkEnd w:id="47"/>
     </w:p>
     <w:p>
       <w:pPr>
         <w:pStyle w:val="4"/>
       </w:pPr>
-      <w:bookmarkStart w:id="47" w:name="_Toc230160112"/>
-      <w:bookmarkStart w:id="48" w:name="_Toc41042326"/>
+      <w:bookmarkStart w:id="48" w:name="_Toc230160112"/>
       <w:bookmarkStart w:id="49" w:name="_Toc231633300"/>
+      <w:bookmarkStart w:id="50" w:name="_Toc41042326"/>
       <w:r>
         <w:t>Yêu cầu chức năng</w:t>
       </w:r>
-      <w:bookmarkEnd w:id="47"/>
       <w:bookmarkEnd w:id="48"/>
       <w:bookmarkEnd w:id="49"/>
+      <w:bookmarkEnd w:id="50"/>
     </w:p>
     <w:p>
       <w:pPr>
@@ -11301,15 +12163,15 @@
       <w:pPr>
         <w:pStyle w:val="4"/>
       </w:pPr>
-      <w:bookmarkStart w:id="50" w:name="_Toc231633301"/>
-      <w:bookmarkStart w:id="51" w:name="_Toc1623102445"/>
-      <w:bookmarkStart w:id="52" w:name="_Toc230160113"/>
+      <w:bookmarkStart w:id="51" w:name="_Toc231633301"/>
+      <w:bookmarkStart w:id="52" w:name="_Toc1623102445"/>
+      <w:bookmarkStart w:id="53" w:name="_Toc230160113"/>
       <w:r>
         <w:t>Yêu cầu phi chức năng</w:t>
       </w:r>
-      <w:bookmarkEnd w:id="50"/>
       <w:bookmarkEnd w:id="51"/>
       <w:bookmarkEnd w:id="52"/>
+      <w:bookmarkEnd w:id="53"/>
     </w:p>
     <w:p>
       <w:pPr>
@@ -11367,29 +12229,29 @@
       <w:pPr>
         <w:pStyle w:val="3"/>
       </w:pPr>
-      <w:bookmarkStart w:id="53" w:name="_Toc1209300568"/>
       <w:bookmarkStart w:id="54" w:name="_Toc231633302"/>
-      <w:bookmarkStart w:id="55" w:name="_Toc230160116"/>
+      <w:bookmarkStart w:id="55" w:name="_Toc1209300568"/>
+      <w:bookmarkStart w:id="56" w:name="_Toc230160116"/>
       <w:r>
         <w:t>Thiết kế dữ liệu</w:t>
       </w:r>
-      <w:bookmarkEnd w:id="53"/>
       <w:bookmarkEnd w:id="54"/>
       <w:bookmarkEnd w:id="55"/>
+      <w:bookmarkEnd w:id="56"/>
     </w:p>
     <w:p>
       <w:pPr>
         <w:pStyle w:val="4"/>
       </w:pPr>
-      <w:bookmarkStart w:id="56" w:name="_Toc230160117"/>
-      <w:bookmarkStart w:id="57" w:name="_Toc231633303"/>
-      <w:bookmarkStart w:id="58" w:name="_Toc1599070925"/>
+      <w:bookmarkStart w:id="57" w:name="_Toc230160117"/>
+      <w:bookmarkStart w:id="58" w:name="_Toc231633303"/>
+      <w:bookmarkStart w:id="59" w:name="_Toc1599070925"/>
       <w:r>
         <w:t>Cấu trúc lưu trữ</w:t>
       </w:r>
-      <w:bookmarkEnd w:id="56"/>
       <w:bookmarkEnd w:id="57"/>
       <w:bookmarkEnd w:id="58"/>
+      <w:bookmarkEnd w:id="59"/>
     </w:p>
     <w:p>
       <w:pPr>
@@ -11450,14 +12312,14 @@
       <w:r>
         <w:fldChar w:fldCharType="end"/>
       </w:r>
-      <w:bookmarkStart w:id="59" w:name="_Toc28132"/>
+      <w:bookmarkStart w:id="60" w:name="_Toc28132"/>
       <w:r>
         <w:rPr>
           <w:lang w:val="en-US"/>
         </w:rPr>
         <w:t xml:space="preserve"> Danh sách trang (page) của website</w:t>
       </w:r>
-      <w:bookmarkEnd w:id="59"/>
+      <w:bookmarkEnd w:id="60"/>
     </w:p>
     <w:tbl>
       <w:tblPr>
@@ -12407,15 +13269,15 @@
       <w:pPr>
         <w:pStyle w:val="4"/>
       </w:pPr>
-      <w:bookmarkStart w:id="60" w:name="_Toc230160118"/>
-      <w:bookmarkStart w:id="61" w:name="_Toc231633304"/>
-      <w:bookmarkStart w:id="62" w:name="_Toc25378810"/>
+      <w:bookmarkStart w:id="61" w:name="_Toc230160118"/>
+      <w:bookmarkStart w:id="62" w:name="_Toc231633304"/>
+      <w:bookmarkStart w:id="63" w:name="_Toc25378810"/>
       <w:r>
         <w:t>Đặc tả chi tiết</w:t>
       </w:r>
-      <w:bookmarkEnd w:id="60"/>
       <w:bookmarkEnd w:id="61"/>
       <w:bookmarkEnd w:id="62"/>
+      <w:bookmarkEnd w:id="63"/>
     </w:p>
     <w:p>
       <w:pPr>
@@ -12483,14 +13345,14 @@
       <w:r>
         <w:fldChar w:fldCharType="end"/>
       </w:r>
-      <w:bookmarkStart w:id="63" w:name="_Toc22157"/>
+      <w:bookmarkStart w:id="64" w:name="_Toc22157"/>
       <w:r>
         <w:rPr>
           <w:lang w:val="en-US"/>
         </w:rPr>
         <w:t xml:space="preserve"> Đặc tả dữ liệu sản phẩm</w:t>
       </w:r>
-      <w:bookmarkEnd w:id="63"/>
+      <w:bookmarkEnd w:id="64"/>
     </w:p>
     <w:tbl>
       <w:tblPr>
@@ -13337,15 +14199,15 @@
       <w:pPr>
         <w:pStyle w:val="3"/>
       </w:pPr>
-      <w:bookmarkStart w:id="64" w:name="_Toc1066954631"/>
       <w:bookmarkStart w:id="65" w:name="_Toc231633305"/>
-      <w:bookmarkStart w:id="66" w:name="_Toc230160119"/>
+      <w:bookmarkStart w:id="66" w:name="_Toc1066954631"/>
+      <w:bookmarkStart w:id="67" w:name="_Toc230160119"/>
       <w:r>
         <w:t>Thiết kế chức năng</w:t>
       </w:r>
-      <w:bookmarkEnd w:id="64"/>
       <w:bookmarkEnd w:id="65"/>
       <w:bookmarkEnd w:id="66"/>
+      <w:bookmarkEnd w:id="67"/>
     </w:p>
     <w:p>
       <w:pPr>
@@ -13430,29 +14292,29 @@
       <w:pPr>
         <w:pStyle w:val="3"/>
       </w:pPr>
-      <w:bookmarkStart w:id="67" w:name="_Toc230160120"/>
-      <w:bookmarkStart w:id="68" w:name="_Toc1871634843"/>
-      <w:bookmarkStart w:id="69" w:name="_Toc231633306"/>
+      <w:bookmarkStart w:id="68" w:name="_Toc230160120"/>
+      <w:bookmarkStart w:id="69" w:name="_Toc1871634843"/>
+      <w:bookmarkStart w:id="70" w:name="_Toc231633306"/>
       <w:r>
         <w:t>Thiết kế giao diện</w:t>
       </w:r>
-      <w:bookmarkEnd w:id="67"/>
       <w:bookmarkEnd w:id="68"/>
       <w:bookmarkEnd w:id="69"/>
+      <w:bookmarkEnd w:id="70"/>
     </w:p>
     <w:p>
       <w:pPr>
         <w:pStyle w:val="4"/>
       </w:pPr>
-      <w:bookmarkStart w:id="70" w:name="_Toc231633307"/>
-      <w:bookmarkStart w:id="71" w:name="_Toc230160121"/>
-      <w:bookmarkStart w:id="72" w:name="_Toc705568677"/>
+      <w:bookmarkStart w:id="71" w:name="_Toc231633307"/>
+      <w:bookmarkStart w:id="72" w:name="_Toc230160121"/>
+      <w:bookmarkStart w:id="73" w:name="_Toc705568677"/>
       <w:r>
         <w:t>Sơ đồ website</w:t>
       </w:r>
-      <w:bookmarkEnd w:id="70"/>
       <w:bookmarkEnd w:id="71"/>
       <w:bookmarkEnd w:id="72"/>
+      <w:bookmarkEnd w:id="73"/>
     </w:p>
     <w:p>
       <w:pPr>
@@ -13567,28 +14429,30 @@
       <w:r>
         <w:fldChar w:fldCharType="end"/>
       </w:r>
-      <w:bookmarkStart w:id="73" w:name="_Toc9283"/>
+      <w:bookmarkStart w:id="74" w:name="_Toc9283"/>
+      <w:bookmarkStart w:id="75" w:name="_Toc24493"/>
       <w:r>
         <w:rPr>
           <w:lang w:val="en-US"/>
         </w:rPr>
         <w:t>Sơ đồ cấu trúc website Sunshine</w:t>
-      </w:r>
-      <w:bookmarkEnd w:id="73"/>
-    </w:p>
-    <w:p>
-      <w:pPr>
-        <w:pStyle w:val="4"/>
-      </w:pPr>
-      <w:bookmarkStart w:id="74" w:name="_Toc231633308"/>
-      <w:bookmarkStart w:id="75" w:name="_Toc230160122"/>
-      <w:bookmarkStart w:id="76" w:name="_Toc1852499346"/>
-      <w:r>
-        <w:t>Giao diện trang chủ</w:t>
       </w:r>
       <w:bookmarkEnd w:id="74"/>
       <w:bookmarkEnd w:id="75"/>
+    </w:p>
+    <w:p>
+      <w:pPr>
+        <w:pStyle w:val="4"/>
+      </w:pPr>
+      <w:bookmarkStart w:id="76" w:name="_Toc230160122"/>
+      <w:bookmarkStart w:id="77" w:name="_Toc231633308"/>
+      <w:bookmarkStart w:id="78" w:name="_Toc1852499346"/>
+      <w:r>
+        <w:t>Giao diện trang chủ</w:t>
+      </w:r>
       <w:bookmarkEnd w:id="76"/>
+      <w:bookmarkEnd w:id="77"/>
+      <w:bookmarkEnd w:id="78"/>
     </w:p>
     <w:p>
       <w:pPr>
@@ -13696,28 +14560,30 @@
       <w:r>
         <w:fldChar w:fldCharType="end"/>
       </w:r>
-      <w:bookmarkStart w:id="77" w:name="_Toc20937"/>
+      <w:bookmarkStart w:id="79" w:name="_Toc20937"/>
+      <w:bookmarkStart w:id="80" w:name="_Toc23408"/>
       <w:r>
         <w:rPr>
           <w:lang w:val="en-US"/>
         </w:rPr>
         <w:t xml:space="preserve"> Giao diện trang chủ</w:t>
       </w:r>
-      <w:bookmarkEnd w:id="77"/>
-    </w:p>
-    <w:p>
-      <w:pPr>
-        <w:pStyle w:val="4"/>
-      </w:pPr>
-      <w:bookmarkStart w:id="78" w:name="_Toc230160123"/>
-      <w:bookmarkStart w:id="79" w:name="_Toc231633309"/>
-      <w:bookmarkStart w:id="80" w:name="_Toc1838141016"/>
-      <w:r>
-        <w:t>Giao diện trang giới thiệu</w:t>
-      </w:r>
-      <w:bookmarkEnd w:id="78"/>
       <w:bookmarkEnd w:id="79"/>
       <w:bookmarkEnd w:id="80"/>
+    </w:p>
+    <w:p>
+      <w:pPr>
+        <w:pStyle w:val="4"/>
+      </w:pPr>
+      <w:bookmarkStart w:id="81" w:name="_Toc1838141016"/>
+      <w:bookmarkStart w:id="82" w:name="_Toc231633309"/>
+      <w:bookmarkStart w:id="83" w:name="_Toc230160123"/>
+      <w:r>
+        <w:t>Giao diện trang giới thiệu</w:t>
+      </w:r>
+      <w:bookmarkEnd w:id="81"/>
+      <w:bookmarkEnd w:id="82"/>
+      <w:bookmarkEnd w:id="83"/>
     </w:p>
     <w:p>
       <w:pPr>
@@ -13833,26 +14699,28 @@
       <w:r>
         <w:fldChar w:fldCharType="end"/>
       </w:r>
-      <w:bookmarkStart w:id="81" w:name="_Toc7934"/>
+      <w:bookmarkStart w:id="84" w:name="_Toc7934"/>
+      <w:bookmarkStart w:id="85" w:name="_Toc2531"/>
       <w:r>
         <w:rPr>
           <w:lang w:val="en-US"/>
         </w:rPr>
         <w:t xml:space="preserve"> Giao diện trang giới thiệu</w:t>
       </w:r>
-      <w:bookmarkEnd w:id="81"/>
+      <w:bookmarkEnd w:id="84"/>
+      <w:bookmarkEnd w:id="85"/>
     </w:p>
     <w:p>
       <w:pPr>
         <w:pStyle w:val="4"/>
       </w:pPr>
-      <w:bookmarkStart w:id="82" w:name="_Toc874178617"/>
-      <w:bookmarkStart w:id="83" w:name="_Toc231633310"/>
+      <w:bookmarkStart w:id="86" w:name="_Toc231633310"/>
+      <w:bookmarkStart w:id="87" w:name="_Toc874178617"/>
       <w:r>
         <w:t>Giao diện trang sản phẩm</w:t>
       </w:r>
-      <w:bookmarkEnd w:id="82"/>
-      <w:bookmarkEnd w:id="83"/>
+      <w:bookmarkEnd w:id="86"/>
+      <w:bookmarkEnd w:id="87"/>
     </w:p>
     <w:p>
       <w:pPr>
@@ -13974,26 +14842,28 @@
       <w:r>
         <w:fldChar w:fldCharType="end"/>
       </w:r>
-      <w:bookmarkStart w:id="84" w:name="_Toc13245"/>
+      <w:bookmarkStart w:id="88" w:name="_Toc13245"/>
+      <w:bookmarkStart w:id="89" w:name="_Toc513"/>
       <w:r>
         <w:rPr>
           <w:lang w:val="en-US"/>
         </w:rPr>
         <w:t xml:space="preserve"> Giao diện trang sản phẩm</w:t>
       </w:r>
-      <w:bookmarkEnd w:id="84"/>
+      <w:bookmarkEnd w:id="88"/>
+      <w:bookmarkEnd w:id="89"/>
     </w:p>
     <w:p>
       <w:pPr>
         <w:pStyle w:val="4"/>
       </w:pPr>
-      <w:bookmarkStart w:id="85" w:name="_Toc1048210789"/>
-      <w:bookmarkStart w:id="86" w:name="_Toc231633311"/>
+      <w:bookmarkStart w:id="90" w:name="_Toc1048210789"/>
+      <w:bookmarkStart w:id="91" w:name="_Toc231633311"/>
       <w:r>
         <w:t>Giao diện trang liên hệ</w:t>
       </w:r>
-      <w:bookmarkEnd w:id="85"/>
-      <w:bookmarkEnd w:id="86"/>
+      <w:bookmarkEnd w:id="90"/>
+      <w:bookmarkEnd w:id="91"/>
     </w:p>
     <w:p>
       <w:pPr>
@@ -14105,14 +14975,16 @@
       <w:r>
         <w:fldChar w:fldCharType="end"/>
       </w:r>
-      <w:bookmarkStart w:id="87" w:name="_Toc15881"/>
+      <w:bookmarkStart w:id="92" w:name="_Toc15881"/>
+      <w:bookmarkStart w:id="93" w:name="_Toc508"/>
       <w:r>
         <w:rPr>
           <w:lang w:val="en-US"/>
         </w:rPr>
         <w:t xml:space="preserve"> Giao diện trang liên hệ</w:t>
       </w:r>
-      <w:bookmarkEnd w:id="87"/>
+      <w:bookmarkEnd w:id="92"/>
+      <w:bookmarkEnd w:id="93"/>
     </w:p>
     <w:p/>
     <w:p/>
@@ -14125,29 +14997,29 @@
       <w:pPr>
         <w:pStyle w:val="2"/>
       </w:pPr>
-      <w:bookmarkStart w:id="88" w:name="_Toc294078174"/>
-      <w:bookmarkStart w:id="89" w:name="_Toc231633312"/>
-      <w:bookmarkStart w:id="90" w:name="_Toc230160124"/>
+      <w:bookmarkStart w:id="94" w:name="_Toc231633312"/>
+      <w:bookmarkStart w:id="95" w:name="_Toc294078174"/>
+      <w:bookmarkStart w:id="96" w:name="_Toc230160124"/>
       <w:r>
         <w:t>KẾT QUẢ THỰC NGHIỆM</w:t>
       </w:r>
-      <w:bookmarkEnd w:id="88"/>
-      <w:bookmarkEnd w:id="89"/>
-      <w:bookmarkEnd w:id="90"/>
+      <w:bookmarkEnd w:id="94"/>
+      <w:bookmarkEnd w:id="95"/>
+      <w:bookmarkEnd w:id="96"/>
     </w:p>
     <w:p>
       <w:pPr>
         <w:pStyle w:val="3"/>
       </w:pPr>
-      <w:bookmarkStart w:id="91" w:name="_Toc2069225048"/>
-      <w:bookmarkStart w:id="92" w:name="_Toc231633313"/>
-      <w:bookmarkStart w:id="93" w:name="_Toc230160125"/>
+      <w:bookmarkStart w:id="97" w:name="_Toc231633313"/>
+      <w:bookmarkStart w:id="98" w:name="_Toc230160125"/>
+      <w:bookmarkStart w:id="99" w:name="_Toc2069225048"/>
       <w:r>
         <w:t>Dữ liệu thử nghiệm</w:t>
       </w:r>
-      <w:bookmarkEnd w:id="91"/>
-      <w:bookmarkEnd w:id="92"/>
-      <w:bookmarkEnd w:id="93"/>
+      <w:bookmarkEnd w:id="97"/>
+      <w:bookmarkEnd w:id="98"/>
+      <w:bookmarkEnd w:id="99"/>
     </w:p>
     <w:p>
       <w:pPr>
@@ -14225,14 +15097,14 @@
       <w:r>
         <w:fldChar w:fldCharType="end"/>
       </w:r>
-      <w:bookmarkStart w:id="94" w:name="_Toc23645"/>
+      <w:bookmarkStart w:id="100" w:name="_Toc23645"/>
       <w:r>
         <w:rPr>
           <w:lang w:val="en-US"/>
         </w:rPr>
         <w:t xml:space="preserve"> Dữ liệu sản phẩm thử nghiệm</w:t>
       </w:r>
-      <w:bookmarkEnd w:id="94"/>
+      <w:bookmarkEnd w:id="100"/>
     </w:p>
     <w:tbl>
       <w:tblPr>
@@ -14849,29 +15721,29 @@
       <w:pPr>
         <w:pStyle w:val="3"/>
       </w:pPr>
-      <w:bookmarkStart w:id="95" w:name="_Toc231633314"/>
-      <w:bookmarkStart w:id="96" w:name="_Toc230160126"/>
-      <w:bookmarkStart w:id="97" w:name="_Toc345872408"/>
+      <w:bookmarkStart w:id="101" w:name="_Toc231633314"/>
+      <w:bookmarkStart w:id="102" w:name="_Toc230160126"/>
+      <w:bookmarkStart w:id="103" w:name="_Toc345872408"/>
       <w:r>
         <w:t>Kết quả thực nghiệm</w:t>
       </w:r>
-      <w:bookmarkEnd w:id="95"/>
-      <w:bookmarkEnd w:id="96"/>
-      <w:bookmarkEnd w:id="97"/>
+      <w:bookmarkEnd w:id="101"/>
+      <w:bookmarkEnd w:id="102"/>
+      <w:bookmarkEnd w:id="103"/>
     </w:p>
     <w:p>
       <w:pPr>
         <w:pStyle w:val="4"/>
       </w:pPr>
-      <w:bookmarkStart w:id="98" w:name="_Toc231633315"/>
-      <w:bookmarkStart w:id="99" w:name="_Toc230160127"/>
-      <w:bookmarkStart w:id="100" w:name="_Toc425070188"/>
+      <w:bookmarkStart w:id="104" w:name="_Toc230160127"/>
+      <w:bookmarkStart w:id="105" w:name="_Toc231633315"/>
+      <w:bookmarkStart w:id="106" w:name="_Toc425070188"/>
       <w:r>
         <w:t>Giao diện trang chủ</w:t>
       </w:r>
-      <w:bookmarkEnd w:id="98"/>
-      <w:bookmarkEnd w:id="99"/>
-      <w:bookmarkEnd w:id="100"/>
+      <w:bookmarkEnd w:id="104"/>
+      <w:bookmarkEnd w:id="105"/>
+      <w:bookmarkEnd w:id="106"/>
     </w:p>
     <w:p>
       <w:pPr>
@@ -15013,28 +15885,30 @@
       <w:r>
         <w:fldChar w:fldCharType="end"/>
       </w:r>
-      <w:bookmarkStart w:id="101" w:name="_Toc32082"/>
+      <w:bookmarkStart w:id="107" w:name="_Toc32082"/>
+      <w:bookmarkStart w:id="108" w:name="_Toc17588"/>
       <w:r>
         <w:rPr>
           <w:lang w:val="en-US"/>
         </w:rPr>
         <w:t xml:space="preserve"> Giao diện trang chủ</w:t>
       </w:r>
-      <w:bookmarkEnd w:id="101"/>
+      <w:bookmarkEnd w:id="107"/>
+      <w:bookmarkEnd w:id="108"/>
     </w:p>
     <w:p>
       <w:pPr>
         <w:pStyle w:val="4"/>
       </w:pPr>
-      <w:bookmarkStart w:id="102" w:name="_Toc230160128"/>
-      <w:bookmarkStart w:id="103" w:name="_Toc231633316"/>
-      <w:bookmarkStart w:id="104" w:name="_Toc1893974176"/>
+      <w:bookmarkStart w:id="109" w:name="_Toc230160128"/>
+      <w:bookmarkStart w:id="110" w:name="_Toc231633316"/>
+      <w:bookmarkStart w:id="111" w:name="_Toc1893974176"/>
       <w:r>
         <w:t>Giao diện trang giới thiệu</w:t>
       </w:r>
-      <w:bookmarkEnd w:id="102"/>
-      <w:bookmarkEnd w:id="103"/>
-      <w:bookmarkEnd w:id="104"/>
+      <w:bookmarkEnd w:id="109"/>
+      <w:bookmarkEnd w:id="110"/>
+      <w:bookmarkEnd w:id="111"/>
     </w:p>
     <w:p>
       <w:pPr>
@@ -15143,26 +16017,28 @@
       <w:r>
         <w:fldChar w:fldCharType="end"/>
       </w:r>
-      <w:bookmarkStart w:id="105" w:name="_Toc31001"/>
+      <w:bookmarkStart w:id="112" w:name="_Toc31001"/>
+      <w:bookmarkStart w:id="113" w:name="_Toc24503"/>
       <w:r>
         <w:rPr>
           <w:lang w:val="en-US"/>
         </w:rPr>
         <w:t xml:space="preserve"> Giao diện trang giới thiệu</w:t>
       </w:r>
-      <w:bookmarkEnd w:id="105"/>
+      <w:bookmarkEnd w:id="112"/>
+      <w:bookmarkEnd w:id="113"/>
     </w:p>
     <w:p>
       <w:pPr>
         <w:pStyle w:val="4"/>
       </w:pPr>
-      <w:bookmarkStart w:id="106" w:name="_Toc231633317"/>
-      <w:bookmarkStart w:id="107" w:name="_Toc1176598989"/>
+      <w:bookmarkStart w:id="114" w:name="_Toc1176598989"/>
+      <w:bookmarkStart w:id="115" w:name="_Toc231633317"/>
       <w:r>
         <w:t>Giao diện trang sản phẩm</w:t>
       </w:r>
-      <w:bookmarkEnd w:id="106"/>
-      <w:bookmarkEnd w:id="107"/>
+      <w:bookmarkEnd w:id="114"/>
+      <w:bookmarkEnd w:id="115"/>
     </w:p>
     <w:p>
       <w:pPr>
@@ -15186,19 +16062,20 @@
       <w:r>
         <w:drawing>
           <wp:inline distT="0" distB="0" distL="0" distR="0">
-            <wp:extent cx="5551805" cy="3039745"/>
+            <wp:extent cx="5551805" cy="5000625"/>
             <wp:effectExtent l="0" t="0" r="0" b="0"/>
-            <wp:docPr id="412599921" name="drawing"/>
+            <wp:docPr id="412599921" name="drawing" descr="C:/Users/KIM NGAN/OneDrive/Hình ảnh/Ảnh chụp màn hình/Screenshot 2026-06-09 094924.pngScreenshot 2026-06-09 094924"/>
             <wp:cNvGraphicFramePr/>
             <a:graphic xmlns:a="http://schemas.openxmlformats.org/drawingml/2006/main">
               <a:graphicData uri="http://schemas.openxmlformats.org/drawingml/2006/picture">
                 <pic:pic xmlns:pic="http://schemas.openxmlformats.org/drawingml/2006/picture">
                   <pic:nvPicPr>
-                    <pic:cNvPr id="412599921" name="drawing"/>
+                    <pic:cNvPr id="412599921" name="drawing" descr="C:/Users/KIM NGAN/OneDrive/Hình ảnh/Ảnh chụp màn hình/Screenshot 2026-06-09 094924.pngScreenshot 2026-06-09 094924"/>
                     <pic:cNvPicPr/>
                   </pic:nvPicPr>
                   <pic:blipFill>
-                    <a:blip r:embed="rId17"/>
+                    <a:blip r:embed="rId19"/>
+                    <a:srcRect t="-2919" b="-1161"/>
                     <a:stretch>
                       <a:fillRect/>
                     </a:stretch>
@@ -15206,7 +16083,7 @@
                   <pic:spPr>
                     <a:xfrm>
                       <a:off x="0" y="0"/>
-                      <a:ext cx="5552378" cy="3040263"/>
+                      <a:ext cx="5551805" cy="5000625"/>
                     </a:xfrm>
                     <a:prstGeom prst="rect">
                       <a:avLst/>
@@ -15269,14 +16146,16 @@
       <w:r>
         <w:fldChar w:fldCharType="end"/>
       </w:r>
-      <w:bookmarkStart w:id="108" w:name="_Toc17805"/>
+      <w:bookmarkStart w:id="116" w:name="_Toc17805"/>
+      <w:bookmarkStart w:id="117" w:name="_Toc22112"/>
       <w:r>
         <w:rPr>
           <w:lang w:val="en-US"/>
         </w:rPr>
         <w:t xml:space="preserve"> Giao diện trang sản phẩm</w:t>
       </w:r>
-      <w:bookmarkEnd w:id="108"/>
+      <w:bookmarkEnd w:id="116"/>
+      <w:bookmarkEnd w:id="117"/>
     </w:p>
     <w:p>
       <w:pPr>
@@ -15286,8 +16165,8 @@
           <w:szCs w:val="26"/>
         </w:rPr>
       </w:pPr>
-      <w:bookmarkStart w:id="109" w:name="_Toc767427422"/>
-      <w:bookmarkStart w:id="110" w:name="_Toc231633318"/>
+      <w:bookmarkStart w:id="118" w:name="_Toc231633318"/>
+      <w:bookmarkStart w:id="119" w:name="_Toc767427422"/>
       <w:r>
         <w:rPr>
           <w:rFonts w:eastAsia="Times New Roman" w:cs="Times New Roman"/>
@@ -15295,8 +16174,8 @@
         </w:rPr>
         <w:t>Chức năng lọc sản phẩm</w:t>
       </w:r>
-      <w:bookmarkEnd w:id="109"/>
-      <w:bookmarkEnd w:id="110"/>
+      <w:bookmarkEnd w:id="118"/>
+      <w:bookmarkEnd w:id="119"/>
     </w:p>
     <w:p>
       <w:pPr>
@@ -15321,8 +16200,8 @@
         <w:drawing>
           <wp:inline distT="0" distB="0" distL="0" distR="0">
             <wp:extent cx="5581650" cy="4953000"/>
-            <wp:effectExtent l="0" t="0" r="0" b="0"/>
-            <wp:docPr id="1721629758" name="drawing"/>
+            <wp:effectExtent l="0" t="0" r="11430" b="0"/>
+            <wp:docPr id="1721629758" name="drawing" descr="C:/Users/KIM NGAN/OneDrive/Hình ảnh/Ảnh chụp màn hình/Screenshot 2026-06-09 094850.pngScreenshot 2026-06-09 094850"/>
             <wp:cNvGraphicFramePr>
               <a:graphicFrameLocks xmlns:a="http://schemas.openxmlformats.org/drawingml/2006/main" noChangeAspect="1"/>
             </wp:cNvGraphicFramePr>
@@ -15330,13 +16209,14 @@
               <a:graphicData uri="http://schemas.openxmlformats.org/drawingml/2006/picture">
                 <pic:pic xmlns:pic="http://schemas.openxmlformats.org/drawingml/2006/picture">
                   <pic:nvPicPr>
-                    <pic:cNvPr id="1721629758" name="drawing"/>
+                    <pic:cNvPr id="1721629758" name="drawing" descr="C:/Users/KIM NGAN/OneDrive/Hình ảnh/Ảnh chụp màn hình/Screenshot 2026-06-09 094850.pngScreenshot 2026-06-09 094850"/>
                     <pic:cNvPicPr>
                       <a:picLocks noChangeAspect="1"/>
                     </pic:cNvPicPr>
                   </pic:nvPicPr>
                   <pic:blipFill>
-                    <a:blip r:embed="rId19"/>
+                    <a:blip r:embed="rId20"/>
+                    <a:srcRect l="1782" r="1782"/>
                     <a:stretch>
                       <a:fillRect/>
                     </a:stretch>
@@ -15406,14 +16286,16 @@
       <w:r>
         <w:fldChar w:fldCharType="end"/>
       </w:r>
-      <w:bookmarkStart w:id="111" w:name="_Toc3591"/>
+      <w:bookmarkStart w:id="120" w:name="_Toc3591"/>
+      <w:bookmarkStart w:id="121" w:name="_Toc13010"/>
       <w:r>
         <w:rPr>
           <w:lang w:val="en-US"/>
         </w:rPr>
         <w:t xml:space="preserve"> Chức năng lọc sản phẩm theo danh mục</w:t>
       </w:r>
-      <w:bookmarkEnd w:id="111"/>
+      <w:bookmarkEnd w:id="120"/>
+      <w:bookmarkEnd w:id="121"/>
     </w:p>
     <w:p>
       <w:pPr>
@@ -15423,8 +16305,8 @@
           <w:szCs w:val="26"/>
         </w:rPr>
       </w:pPr>
-      <w:bookmarkStart w:id="112" w:name="_Toc231633319"/>
-      <w:bookmarkStart w:id="113" w:name="_Toc815047645"/>
+      <w:bookmarkStart w:id="122" w:name="_Toc815047645"/>
+      <w:bookmarkStart w:id="123" w:name="_Toc231633319"/>
       <w:r>
         <w:rPr>
           <w:rFonts w:eastAsia="Times New Roman" w:cs="Times New Roman"/>
@@ -15432,8 +16314,8 @@
         </w:rPr>
         <w:t>Giao diện trang chi tiết sản phẩm</w:t>
       </w:r>
-      <w:bookmarkEnd w:id="112"/>
-      <w:bookmarkEnd w:id="113"/>
+      <w:bookmarkEnd w:id="122"/>
+      <w:bookmarkEnd w:id="123"/>
     </w:p>
     <w:p>
       <w:pPr>
@@ -15473,7 +16355,7 @@
                     </pic:cNvPicPr>
                   </pic:nvPicPr>
                   <pic:blipFill>
-                    <a:blip r:embed="rId20"/>
+                    <a:blip r:embed="rId21"/>
                     <a:stretch>
                       <a:fillRect/>
                     </a:stretch>
@@ -15542,14 +16424,16 @@
       <w:r>
         <w:fldChar w:fldCharType="end"/>
       </w:r>
-      <w:bookmarkStart w:id="114" w:name="_Toc7327"/>
+      <w:bookmarkStart w:id="124" w:name="_Toc7327"/>
+      <w:bookmarkStart w:id="125" w:name="_Toc15328"/>
       <w:r>
         <w:rPr>
           <w:lang w:val="en-US"/>
         </w:rPr>
         <w:t xml:space="preserve"> Giao diện trang chi tiết sản phẩm</w:t>
       </w:r>
-      <w:bookmarkEnd w:id="114"/>
+      <w:bookmarkEnd w:id="124"/>
+      <w:bookmarkEnd w:id="125"/>
     </w:p>
     <w:p>
       <w:pPr>
@@ -15559,8 +16443,8 @@
           <w:szCs w:val="26"/>
         </w:rPr>
       </w:pPr>
-      <w:bookmarkStart w:id="115" w:name="_Toc599230334"/>
-      <w:bookmarkStart w:id="116" w:name="_Toc231633320"/>
+      <w:bookmarkStart w:id="126" w:name="_Toc231633320"/>
+      <w:bookmarkStart w:id="127" w:name="_Toc599230334"/>
       <w:r>
         <w:rPr>
           <w:rFonts w:eastAsia="Times New Roman" w:cs="Times New Roman"/>
@@ -15568,8 +16452,8 @@
         </w:rPr>
         <w:t>Giao diện trang liên hệ</w:t>
       </w:r>
-      <w:bookmarkEnd w:id="115"/>
-      <w:bookmarkEnd w:id="116"/>
+      <w:bookmarkEnd w:id="126"/>
+      <w:bookmarkEnd w:id="127"/>
     </w:p>
     <w:p>
       <w:pPr>
@@ -15676,14 +16560,16 @@
       <w:r>
         <w:fldChar w:fldCharType="end"/>
       </w:r>
-      <w:bookmarkStart w:id="117" w:name="_Toc3886"/>
+      <w:bookmarkStart w:id="128" w:name="_Toc3886"/>
+      <w:bookmarkStart w:id="129" w:name="_Toc22307"/>
       <w:r>
         <w:rPr>
           <w:lang w:val="en-US"/>
         </w:rPr>
         <w:t xml:space="preserve"> Giao diện trang liên hệ</w:t>
       </w:r>
-      <w:bookmarkEnd w:id="117"/>
+      <w:bookmarkEnd w:id="128"/>
+      <w:bookmarkEnd w:id="129"/>
     </w:p>
     <w:p>
       <w:pPr>
@@ -15707,29 +16593,29 @@
       <w:pPr>
         <w:pStyle w:val="2"/>
       </w:pPr>
-      <w:bookmarkStart w:id="118" w:name="_Toc999028319"/>
-      <w:bookmarkStart w:id="119" w:name="_Toc231633321"/>
-      <w:bookmarkStart w:id="120" w:name="_Toc230160129"/>
+      <w:bookmarkStart w:id="130" w:name="_Toc999028319"/>
+      <w:bookmarkStart w:id="131" w:name="_Toc231633321"/>
+      <w:bookmarkStart w:id="132" w:name="_Toc230160129"/>
       <w:r>
         <w:t>KẾT LUẬN VÀ HƯỚNG PHÁT TRIỂN</w:t>
       </w:r>
-      <w:bookmarkEnd w:id="118"/>
-      <w:bookmarkEnd w:id="119"/>
-      <w:bookmarkEnd w:id="120"/>
+      <w:bookmarkEnd w:id="130"/>
+      <w:bookmarkEnd w:id="131"/>
+      <w:bookmarkEnd w:id="132"/>
     </w:p>
     <w:p>
       <w:pPr>
         <w:pStyle w:val="3"/>
       </w:pPr>
-      <w:bookmarkStart w:id="121" w:name="_Toc231633322"/>
-      <w:bookmarkStart w:id="122" w:name="_Toc1939289256"/>
-      <w:bookmarkStart w:id="123" w:name="_Toc230160130"/>
+      <w:bookmarkStart w:id="133" w:name="_Toc230160130"/>
+      <w:bookmarkStart w:id="134" w:name="_Toc1939289256"/>
+      <w:bookmarkStart w:id="135" w:name="_Toc231633322"/>
       <w:r>
         <w:t>Kết luận</w:t>
       </w:r>
-      <w:bookmarkEnd w:id="121"/>
-      <w:bookmarkEnd w:id="122"/>
-      <w:bookmarkEnd w:id="123"/>
+      <w:bookmarkEnd w:id="133"/>
+      <w:bookmarkEnd w:id="134"/>
+      <w:bookmarkEnd w:id="135"/>
     </w:p>
     <w:p>
       <w:pPr>
@@ -15828,15 +16714,15 @@
       <w:pPr>
         <w:pStyle w:val="3"/>
       </w:pPr>
-      <w:bookmarkStart w:id="124" w:name="_Toc231633323"/>
-      <w:bookmarkStart w:id="125" w:name="_Toc230160131"/>
-      <w:bookmarkStart w:id="126" w:name="_Toc175928631"/>
+      <w:bookmarkStart w:id="136" w:name="_Toc231633323"/>
+      <w:bookmarkStart w:id="137" w:name="_Toc175928631"/>
+      <w:bookmarkStart w:id="138" w:name="_Toc230160131"/>
       <w:r>
         <w:t>Hướng phát triển</w:t>
       </w:r>
-      <w:bookmarkEnd w:id="124"/>
-      <w:bookmarkEnd w:id="125"/>
-      <w:bookmarkEnd w:id="126"/>
+      <w:bookmarkEnd w:id="136"/>
+      <w:bookmarkEnd w:id="137"/>
+      <w:bookmarkEnd w:id="138"/>
     </w:p>
     <w:p>
       <w:pPr>
@@ -16264,7 +17150,7 @@
       <w:sdtPr>
         <w:id w:val="-18244135"/>
         <w:docPartObj>
-          <w:docPartGallery w:val="AutoText"/>
+          <w:docPartGallery w:val="autotext"/>
         </w:docPartObj>
       </w:sdtPr>
       <w:sdtContent/>
@@ -16305,7 +17191,7 @@
     <w:sdtPr>
       <w:id w:val="821391154"/>
       <w:docPartObj>
-        <w:docPartGallery w:val="AutoText"/>
+        <w:docPartGallery w:val="autotext"/>
       </w:docPartObj>
     </w:sdtPr>
     <w:sdtContent>
@@ -16556,9 +17442,9 @@
 <file path=word/numbering.xml><?xml version="1.0" encoding="utf-8"?>
 <w:numbering xmlns:wpc="http://schemas.microsoft.com/office/word/2010/wordprocessingCanvas" xmlns:mc="http://schemas.openxmlformats.org/markup-compatibility/2006" xmlns:o="urn:schemas-microsoft-com:office:office" xmlns:r="http://schemas.openxmlformats.org/officeDocument/2006/relationships" xmlns:m="http://schemas.openxmlformats.org/officeDocument/2006/math" xmlns:v="urn:schemas-microsoft-com:vml" xmlns:wp14="http://schemas.microsoft.com/office/word/2010/wordprocessingDrawing" xmlns:wp="http://schemas.openxmlformats.org/drawingml/2006/wordprocessingDrawing" xmlns:w10="urn:schemas-microsoft-com:office:word" xmlns:w="http://schemas.openxmlformats.org/wordprocessingml/2006/main" xmlns:w14="http://schemas.microsoft.com/office/word/2010/wordml" xmlns:wpg="http://schemas.microsoft.com/office/word/2010/wordprocessingGroup" xmlns:wpi="http://schemas.microsoft.com/office/word/2010/wordprocessingInk" xmlns:wne="http://schemas.microsoft.com/office/word/2006/wordml" xmlns:wps="http://schemas.microsoft.com/office/word/2010/wordprocessingShape" xmlns:wpsCustomData="http://www.wps.cn/officeDocument/2013/wpsCustomData" mc:Ignorable="w14 wp14">
   <w:abstractNum w:abstractNumId="0">
-    <w:nsid w:val="42A5E03E"/>
+    <w:nsid w:val="1A115795"/>
     <w:multiLevelType w:val="multilevel"/>
-    <w:tmpl w:val="42A5E03E"/>
+    <w:tmpl w:val="1A115795"/>
     <w:lvl w:ilvl="0" w:tentative="0">
       <w:start w:val="1"/>
       <w:numFmt w:val="bullet"/>
@@ -16669,6 +17555,232 @@
     </w:lvl>
   </w:abstractNum>
   <w:abstractNum w:abstractNumId="1">
+    <w:nsid w:val="42A5E03E"/>
+    <w:multiLevelType w:val="multilevel"/>
+    <w:tmpl w:val="42A5E03E"/>
+    <w:lvl w:ilvl="0" w:tentative="0">
+      <w:start w:val="1"/>
+      <w:numFmt w:val="bullet"/>
+      <w:lvlText w:val=""/>
+      <w:lvlJc w:val="left"/>
+      <w:pPr>
+        <w:ind w:left="1080" w:hanging="360"/>
+      </w:pPr>
+      <w:rPr>
+        <w:rFonts w:hint="default" w:ascii="Symbol" w:hAnsi="Symbol"/>
+      </w:rPr>
+    </w:lvl>
+    <w:lvl w:ilvl="1" w:tentative="0">
+      <w:start w:val="1"/>
+      <w:numFmt w:val="bullet"/>
+      <w:lvlText w:val="o"/>
+      <w:lvlJc w:val="left"/>
+      <w:pPr>
+        <w:ind w:left="1800" w:hanging="360"/>
+      </w:pPr>
+      <w:rPr>
+        <w:rFonts w:hint="default" w:ascii="Courier New" w:hAnsi="Courier New"/>
+      </w:rPr>
+    </w:lvl>
+    <w:lvl w:ilvl="2" w:tentative="0">
+      <w:start w:val="1"/>
+      <w:numFmt w:val="bullet"/>
+      <w:lvlText w:val=""/>
+      <w:lvlJc w:val="left"/>
+      <w:pPr>
+        <w:ind w:left="2520" w:hanging="360"/>
+      </w:pPr>
+      <w:rPr>
+        <w:rFonts w:hint="default" w:ascii="Wingdings" w:hAnsi="Wingdings"/>
+      </w:rPr>
+    </w:lvl>
+    <w:lvl w:ilvl="3" w:tentative="0">
+      <w:start w:val="1"/>
+      <w:numFmt w:val="bullet"/>
+      <w:lvlText w:val=""/>
+      <w:lvlJc w:val="left"/>
+      <w:pPr>
+        <w:ind w:left="3240" w:hanging="360"/>
+      </w:pPr>
+      <w:rPr>
+        <w:rFonts w:hint="default" w:ascii="Symbol" w:hAnsi="Symbol"/>
+      </w:rPr>
+    </w:lvl>
+    <w:lvl w:ilvl="4" w:tentative="0">
+      <w:start w:val="1"/>
+      <w:numFmt w:val="bullet"/>
+      <w:lvlText w:val="o"/>
+      <w:lvlJc w:val="left"/>
+      <w:pPr>
+        <w:ind w:left="3960" w:hanging="360"/>
+      </w:pPr>
+      <w:rPr>
+        <w:rFonts w:hint="default" w:ascii="Courier New" w:hAnsi="Courier New"/>
+      </w:rPr>
+    </w:lvl>
+    <w:lvl w:ilvl="5" w:tentative="0">
+      <w:start w:val="1"/>
+      <w:numFmt w:val="bullet"/>
+      <w:lvlText w:val=""/>
+      <w:lvlJc w:val="left"/>
+      <w:pPr>
+        <w:ind w:left="4680" w:hanging="360"/>
+      </w:pPr>
+      <w:rPr>
+        <w:rFonts w:hint="default" w:ascii="Wingdings" w:hAnsi="Wingdings"/>
+      </w:rPr>
+    </w:lvl>
+    <w:lvl w:ilvl="6" w:tentative="0">
+      <w:start w:val="1"/>
+      <w:numFmt w:val="bullet"/>
+      <w:lvlText w:val=""/>
+      <w:lvlJc w:val="left"/>
+      <w:pPr>
+        <w:ind w:left="5400" w:hanging="360"/>
+      </w:pPr>
+      <w:rPr>
+        <w:rFonts w:hint="default" w:ascii="Symbol" w:hAnsi="Symbol"/>
+      </w:rPr>
+    </w:lvl>
+    <w:lvl w:ilvl="7" w:tentative="0">
+      <w:start w:val="1"/>
+      <w:numFmt w:val="bullet"/>
+      <w:lvlText w:val="o"/>
+      <w:lvlJc w:val="left"/>
+      <w:pPr>
+        <w:ind w:left="6120" w:hanging="360"/>
+      </w:pPr>
+      <w:rPr>
+        <w:rFonts w:hint="default" w:ascii="Courier New" w:hAnsi="Courier New"/>
+      </w:rPr>
+    </w:lvl>
+    <w:lvl w:ilvl="8" w:tentative="0">
+      <w:start w:val="1"/>
+      <w:numFmt w:val="bullet"/>
+      <w:lvlText w:val=""/>
+      <w:lvlJc w:val="left"/>
+      <w:pPr>
+        <w:ind w:left="6840" w:hanging="360"/>
+      </w:pPr>
+      <w:rPr>
+        <w:rFonts w:hint="default" w:ascii="Wingdings" w:hAnsi="Wingdings"/>
+      </w:rPr>
+    </w:lvl>
+  </w:abstractNum>
+  <w:abstractNum w:abstractNumId="2">
+    <w:nsid w:val="6008A8BB"/>
+    <w:multiLevelType w:val="multilevel"/>
+    <w:tmpl w:val="6008A8BB"/>
+    <w:lvl w:ilvl="0" w:tentative="0">
+      <w:start w:val="1"/>
+      <w:numFmt w:val="bullet"/>
+      <w:lvlText w:val=""/>
+      <w:lvlJc w:val="left"/>
+      <w:pPr>
+        <w:ind w:left="1080" w:hanging="360"/>
+      </w:pPr>
+      <w:rPr>
+        <w:rFonts w:hint="default" w:ascii="Symbol" w:hAnsi="Symbol"/>
+      </w:rPr>
+    </w:lvl>
+    <w:lvl w:ilvl="1" w:tentative="0">
+      <w:start w:val="1"/>
+      <w:numFmt w:val="bullet"/>
+      <w:lvlText w:val="o"/>
+      <w:lvlJc w:val="left"/>
+      <w:pPr>
+        <w:ind w:left="1800" w:hanging="360"/>
+      </w:pPr>
+      <w:rPr>
+        <w:rFonts w:hint="default" w:ascii="Courier New" w:hAnsi="Courier New"/>
+      </w:rPr>
+    </w:lvl>
+    <w:lvl w:ilvl="2" w:tentative="0">
+      <w:start w:val="1"/>
+      <w:numFmt w:val="bullet"/>
+      <w:lvlText w:val=""/>
+      <w:lvlJc w:val="left"/>
+      <w:pPr>
+        <w:ind w:left="2520" w:hanging="360"/>
+      </w:pPr>
+      <w:rPr>
+        <w:rFonts w:hint="default" w:ascii="Wingdings" w:hAnsi="Wingdings"/>
+      </w:rPr>
+    </w:lvl>
+    <w:lvl w:ilvl="3" w:tentative="0">
+      <w:start w:val="1"/>
+      <w:numFmt w:val="bullet"/>
+      <w:lvlText w:val=""/>
+      <w:lvlJc w:val="left"/>
+      <w:pPr>
+        <w:ind w:left="3240" w:hanging="360"/>
+      </w:pPr>
+      <w:rPr>
+        <w:rFonts w:hint="default" w:ascii="Symbol" w:hAnsi="Symbol"/>
+      </w:rPr>
+    </w:lvl>
+    <w:lvl w:ilvl="4" w:tentative="0">
+      <w:start w:val="1"/>
+      <w:numFmt w:val="bullet"/>
+      <w:lvlText w:val="o"/>
+      <w:lvlJc w:val="left"/>
+      <w:pPr>
+        <w:ind w:left="3960" w:hanging="360"/>
+      </w:pPr>
+      <w:rPr>
+        <w:rFonts w:hint="default" w:ascii="Courier New" w:hAnsi="Courier New"/>
+      </w:rPr>
+    </w:lvl>
+    <w:lvl w:ilvl="5" w:tentative="0">
+      <w:start w:val="1"/>
+      <w:numFmt w:val="bullet"/>
+      <w:lvlText w:val=""/>
+      <w:lvlJc w:val="left"/>
+      <w:pPr>
+        <w:ind w:left="4680" w:hanging="360"/>
+      </w:pPr>
+      <w:rPr>
+        <w:rFonts w:hint="default" w:ascii="Wingdings" w:hAnsi="Wingdings"/>
+      </w:rPr>
+    </w:lvl>
+    <w:lvl w:ilvl="6" w:tentative="0">
+      <w:start w:val="1"/>
+      <w:numFmt w:val="bullet"/>
+      <w:lvlText w:val=""/>
+      <w:lvlJc w:val="left"/>
+      <w:pPr>
+        <w:ind w:left="5400" w:hanging="360"/>
+      </w:pPr>
+      <w:rPr>
+        <w:rFonts w:hint="default" w:ascii="Symbol" w:hAnsi="Symbol"/>
+      </w:rPr>
+    </w:lvl>
+    <w:lvl w:ilvl="7" w:tentative="0">
+      <w:start w:val="1"/>
+      <w:numFmt w:val="bullet"/>
+      <w:lvlText w:val="o"/>
+      <w:lvlJc w:val="left"/>
+      <w:pPr>
+        <w:ind w:left="6120" w:hanging="360"/>
+      </w:pPr>
+      <w:rPr>
+        <w:rFonts w:hint="default" w:ascii="Courier New" w:hAnsi="Courier New"/>
+      </w:rPr>
+    </w:lvl>
+    <w:lvl w:ilvl="8" w:tentative="0">
+      <w:start w:val="1"/>
+      <w:numFmt w:val="bullet"/>
+      <w:lvlText w:val=""/>
+      <w:lvlJc w:val="left"/>
+      <w:pPr>
+        <w:ind w:left="6840" w:hanging="360"/>
+      </w:pPr>
+      <w:rPr>
+        <w:rFonts w:hint="default" w:ascii="Wingdings" w:hAnsi="Wingdings"/>
+      </w:rPr>
+    </w:lvl>
+  </w:abstractNum>
+  <w:abstractNum w:abstractNumId="3">
     <w:nsid w:val="7C8F4C02"/>
     <w:multiLevelType w:val="multilevel"/>
     <w:tmpl w:val="7C8F4C02"/>
@@ -16806,11 +17918,133 @@
       </w:rPr>
     </w:lvl>
   </w:abstractNum>
+  <w:abstractNum w:abstractNumId="4">
+    <w:nsid w:val="7D1D6804"/>
+    <w:multiLevelType w:val="multilevel"/>
+    <w:tmpl w:val="7D1D6804"/>
+    <w:lvl w:ilvl="0" w:tentative="0">
+      <w:start w:val="1"/>
+      <w:numFmt w:val="bullet"/>
+      <w:lvlText w:val=""/>
+      <w:lvlJc w:val="left"/>
+      <w:pPr>
+        <w:ind w:left="1080" w:hanging="360"/>
+      </w:pPr>
+      <w:rPr>
+        <w:rFonts w:hint="default" w:ascii="Symbol" w:hAnsi="Symbol"/>
+      </w:rPr>
+    </w:lvl>
+    <w:lvl w:ilvl="1" w:tentative="0">
+      <w:start w:val="1"/>
+      <w:numFmt w:val="bullet"/>
+      <w:lvlText w:val="o"/>
+      <w:lvlJc w:val="left"/>
+      <w:pPr>
+        <w:ind w:left="1800" w:hanging="360"/>
+      </w:pPr>
+      <w:rPr>
+        <w:rFonts w:hint="default" w:ascii="Courier New" w:hAnsi="Courier New"/>
+      </w:rPr>
+    </w:lvl>
+    <w:lvl w:ilvl="2" w:tentative="0">
+      <w:start w:val="1"/>
+      <w:numFmt w:val="bullet"/>
+      <w:lvlText w:val=""/>
+      <w:lvlJc w:val="left"/>
+      <w:pPr>
+        <w:ind w:left="2520" w:hanging="360"/>
+      </w:pPr>
+      <w:rPr>
+        <w:rFonts w:hint="default" w:ascii="Wingdings" w:hAnsi="Wingdings"/>
+      </w:rPr>
+    </w:lvl>
+    <w:lvl w:ilvl="3" w:tentative="0">
+      <w:start w:val="1"/>
+      <w:numFmt w:val="bullet"/>
+      <w:lvlText w:val=""/>
+      <w:lvlJc w:val="left"/>
+      <w:pPr>
+        <w:ind w:left="3240" w:hanging="360"/>
+      </w:pPr>
+      <w:rPr>
+        <w:rFonts w:hint="default" w:ascii="Symbol" w:hAnsi="Symbol"/>
+      </w:rPr>
+    </w:lvl>
+    <w:lvl w:ilvl="4" w:tentative="0">
+      <w:start w:val="1"/>
+      <w:numFmt w:val="bullet"/>
+      <w:lvlText w:val="o"/>
+      <w:lvlJc w:val="left"/>
+      <w:pPr>
+        <w:ind w:left="3960" w:hanging="360"/>
+      </w:pPr>
+      <w:rPr>
+        <w:rFonts w:hint="default" w:ascii="Courier New" w:hAnsi="Courier New"/>
+      </w:rPr>
+    </w:lvl>
+    <w:lvl w:ilvl="5" w:tentative="0">
+      <w:start w:val="1"/>
+      <w:numFmt w:val="bullet"/>
+      <w:lvlText w:val=""/>
+      <w:lvlJc w:val="left"/>
+      <w:pPr>
+        <w:ind w:left="4680" w:hanging="360"/>
+      </w:pPr>
+      <w:rPr>
+        <w:rFonts w:hint="default" w:ascii="Wingdings" w:hAnsi="Wingdings"/>
+      </w:rPr>
+    </w:lvl>
+    <w:lvl w:ilvl="6" w:tentative="0">
+      <w:start w:val="1"/>
+      <w:numFmt w:val="bullet"/>
+      <w:lvlText w:val=""/>
+      <w:lvlJc w:val="left"/>
+      <w:pPr>
+        <w:ind w:left="5400" w:hanging="360"/>
+      </w:pPr>
+      <w:rPr>
+        <w:rFonts w:hint="default" w:ascii="Symbol" w:hAnsi="Symbol"/>
+      </w:rPr>
+    </w:lvl>
+    <w:lvl w:ilvl="7" w:tentative="0">
+      <w:start w:val="1"/>
+      <w:numFmt w:val="bullet"/>
+      <w:lvlText w:val="o"/>
+      <w:lvlJc w:val="left"/>
+      <w:pPr>
+        <w:ind w:left="6120" w:hanging="360"/>
+      </w:pPr>
+      <w:rPr>
+        <w:rFonts w:hint="default" w:ascii="Courier New" w:hAnsi="Courier New"/>
+      </w:rPr>
+    </w:lvl>
+    <w:lvl w:ilvl="8" w:tentative="0">
+      <w:start w:val="1"/>
+      <w:numFmt w:val="bullet"/>
+      <w:lvlText w:val=""/>
+      <w:lvlJc w:val="left"/>
+      <w:pPr>
+        <w:ind w:left="6840" w:hanging="360"/>
+      </w:pPr>
+      <w:rPr>
+        <w:rFonts w:hint="default" w:ascii="Wingdings" w:hAnsi="Wingdings"/>
+      </w:rPr>
+    </w:lvl>
+  </w:abstractNum>
   <w:num w:numId="1">
-    <w:abstractNumId w:val="1"/>
+    <w:abstractNumId w:val="3"/>
   </w:num>
   <w:num w:numId="2">
+    <w:abstractNumId w:val="2"/>
+  </w:num>
+  <w:num w:numId="3">
+    <w:abstractNumId w:val="4"/>
+  </w:num>
+  <w:num w:numId="4">
     <w:abstractNumId w:val="0"/>
+  </w:num>
+  <w:num w:numId="5">
+    <w:abstractNumId w:val="1"/>
   </w:num>
 </w:numbering>
 </file>
@@ -16845,10 +18079,10 @@
     <w:lsdException w:uiPriority="99" w:name="index 7"/>
     <w:lsdException w:uiPriority="99" w:name="index 8"/>
     <w:lsdException w:uiPriority="99" w:name="index 9"/>
-    <w:lsdException w:uiPriority="39" w:semiHidden="0" w:name="toc 1"/>
+    <w:lsdException w:qFormat="1" w:uiPriority="39" w:semiHidden="0" w:name="toc 1"/>
     <w:lsdException w:qFormat="1" w:uiPriority="39" w:semiHidden="0" w:name="toc 2"/>
     <w:lsdException w:qFormat="1" w:uiPriority="39" w:semiHidden="0" w:name="toc 3"/>
-    <w:lsdException w:uiPriority="39" w:semiHidden="0" w:name="toc 4"/>
+    <w:lsdException w:qFormat="1" w:uiPriority="39" w:semiHidden="0" w:name="toc 4"/>
     <w:lsdException w:uiPriority="39" w:name="toc 5"/>
     <w:lsdException w:uiPriority="39" w:name="toc 6"/>
     <w:lsdException w:uiPriority="39" w:name="toc 7"/>
@@ -16858,10 +18092,10 @@
     <w:lsdException w:uiPriority="99" w:name="footnote text"/>
     <w:lsdException w:uiPriority="99" w:name="annotation text"/>
     <w:lsdException w:qFormat="1" w:uiPriority="99" w:semiHidden="0" w:name="header"/>
-    <w:lsdException w:uiPriority="99" w:semiHidden="0" w:name="footer"/>
+    <w:lsdException w:qFormat="1" w:uiPriority="99" w:semiHidden="0" w:name="footer"/>
     <w:lsdException w:uiPriority="99" w:name="index heading"/>
     <w:lsdException w:qFormat="1" w:uiPriority="35" w:semiHidden="0" w:name="caption"/>
-    <w:lsdException w:uiPriority="99" w:name="table of figures"/>
+    <w:lsdException w:qFormat="1" w:uiPriority="99" w:name="table of figures"/>
     <w:lsdException w:uiPriority="99" w:name="envelope address"/>
     <w:lsdException w:uiPriority="99" w:name="envelope return"/>
     <w:lsdException w:uiPriority="99" w:name="footnote reference"/>
@@ -16891,7 +18125,7 @@
     <w:lsdException w:qFormat="1" w:unhideWhenUsed="0" w:uiPriority="10" w:semiHidden="0" w:name="Title"/>
     <w:lsdException w:uiPriority="99" w:name="Closing"/>
     <w:lsdException w:uiPriority="99" w:name="Signature"/>
-    <w:lsdException w:uiPriority="1" w:name="Default Paragraph Font"/>
+    <w:lsdException w:qFormat="1" w:uiPriority="1" w:name="Default Paragraph Font"/>
     <w:lsdException w:uiPriority="99" w:name="Body Text"/>
     <w:lsdException w:uiPriority="99" w:name="Body Text Indent"/>
     <w:lsdException w:uiPriority="99" w:name="List Continue"/>
@@ -16911,7 +18145,7 @@
     <w:lsdException w:uiPriority="99" w:name="Body Text Indent 2"/>
     <w:lsdException w:uiPriority="99" w:name="Body Text Indent 3"/>
     <w:lsdException w:uiPriority="99" w:name="Block Text"/>
-    <w:lsdException w:uiPriority="99" w:semiHidden="0" w:name="Hyperlink"/>
+    <w:lsdException w:qFormat="1" w:uiPriority="99" w:semiHidden="0" w:name="Hyperlink"/>
     <w:lsdException w:uiPriority="99" w:name="FollowedHyperlink"/>
     <w:lsdException w:qFormat="1" w:unhideWhenUsed="0" w:uiPriority="22" w:semiHidden="0" w:name="Strong"/>
     <w:lsdException w:qFormat="1" w:unhideWhenUsed="0" w:uiPriority="20" w:semiHidden="0" w:name="Emphasis"/>
@@ -17342,6 +18576,7 @@
     <w:name w:val="Default Paragraph Font"/>
     <w:semiHidden/>
     <w:unhideWhenUsed/>
+    <w:qFormat/>
     <w:uiPriority w:val="1"/>
   </w:style>
   <w:style w:type="table" w:default="1" w:styleId="12">
@@ -17385,6 +18620,7 @@
     <w:name w:val="footer"/>
     <w:link w:val="25"/>
     <w:unhideWhenUsed/>
+    <w:qFormat/>
     <w:uiPriority w:val="99"/>
     <w:pPr>
       <w:tabs>
@@ -17424,6 +18660,7 @@
     <w:name w:val="Hyperlink"/>
     <w:basedOn w:val="11"/>
     <w:unhideWhenUsed/>
+    <w:qFormat/>
     <w:uiPriority w:val="99"/>
     <w:rPr>
       <w:color w:val="0563C1" w:themeColor="hyperlink"/>
@@ -17460,6 +18697,7 @@
     <w:next w:val="1"/>
     <w:semiHidden/>
     <w:unhideWhenUsed/>
+    <w:qFormat/>
     <w:uiPriority w:val="99"/>
     <w:pPr>
       <w:ind w:leftChars="200" w:hanging="200" w:hangingChars="200"/>
@@ -17483,6 +18721,7 @@
   <w:style w:type="paragraph" w:styleId="20">
     <w:name w:val="toc 1"/>
     <w:unhideWhenUsed/>
+    <w:qFormat/>
     <w:uiPriority w:val="39"/>
     <w:pPr>
       <w:spacing w:after="100" w:line="259" w:lineRule="auto"/>
@@ -17529,6 +18768,7 @@
   <w:style w:type="paragraph" w:styleId="23">
     <w:name w:val="toc 4"/>
     <w:unhideWhenUsed/>
+    <w:qFormat/>
     <w:uiPriority w:val="39"/>
     <w:pPr>
       <w:spacing w:after="100" w:line="259" w:lineRule="auto"/>
@@ -17545,12 +18785,14 @@
     <w:name w:val="Header Char"/>
     <w:basedOn w:val="11"/>
     <w:link w:val="15"/>
+    <w:qFormat/>
     <w:uiPriority w:val="99"/>
   </w:style>
   <w:style w:type="character" w:customStyle="1" w:styleId="25">
     <w:name w:val="Footer Char"/>
     <w:basedOn w:val="11"/>
     <w:link w:val="14"/>
+    <w:qFormat/>
     <w:uiPriority w:val="99"/>
   </w:style>
   <w:style w:type="paragraph" w:styleId="26">
@@ -17573,6 +18815,7 @@
     <w:name w:val="Heading 1 Char"/>
     <w:basedOn w:val="11"/>
     <w:link w:val="2"/>
+    <w:qFormat/>
     <w:uiPriority w:val="9"/>
     <w:rPr>
       <w:rFonts w:eastAsiaTheme="majorEastAsia" w:cstheme="majorBidi"/>
@@ -17623,6 +18866,7 @@
     <w:name w:val="Heading 4 Char"/>
     <w:basedOn w:val="11"/>
     <w:link w:val="5"/>
+    <w:qFormat/>
     <w:uiPriority w:val="9"/>
     <w:rPr>
       <w:rFonts w:eastAsiaTheme="majorEastAsia" w:cstheme="majorBidi"/>
@@ -17641,6 +18885,7 @@
     <w:basedOn w:val="11"/>
     <w:link w:val="6"/>
     <w:semiHidden/>
+    <w:qFormat/>
     <w:uiPriority w:val="9"/>
     <w:rPr>
       <w:rFonts w:asciiTheme="majorHAnsi" w:hAnsiTheme="majorHAnsi" w:eastAsiaTheme="majorEastAsia" w:cstheme="majorBidi"/>
@@ -17652,6 +18897,7 @@
     <w:basedOn w:val="11"/>
     <w:link w:val="7"/>
     <w:semiHidden/>
+    <w:qFormat/>
     <w:uiPriority w:val="9"/>
     <w:rPr>
       <w:rFonts w:asciiTheme="majorHAnsi" w:hAnsiTheme="majorHAnsi" w:eastAsiaTheme="majorEastAsia" w:cstheme="majorBidi"/>
@@ -17663,6 +18909,7 @@
     <w:basedOn w:val="11"/>
     <w:link w:val="8"/>
     <w:semiHidden/>
+    <w:qFormat/>
     <w:uiPriority w:val="9"/>
     <w:rPr>
       <w:rFonts w:asciiTheme="majorHAnsi" w:hAnsiTheme="majorHAnsi" w:eastAsiaTheme="majorEastAsia" w:cstheme="majorBidi"/>
@@ -17772,6 +19019,7 @@
   <w:style w:type="table" w:customStyle="1" w:styleId="39">
     <w:name w:val="myTable"/>
     <w:basedOn w:val="12"/>
+    <w:qFormat/>
     <w:uiPriority w:val="99"/>
     <w:pPr>
       <w:spacing w:after="0" w:line="240" w:lineRule="auto"/>

</xml_diff>